<commit_message>
Add more code description
</commit_message>
<xml_diff>
--- a/Word/SmartClock_Projekdokumentation.docx
+++ b/Word/SmartClock_Projekdokumentation.docx
@@ -741,7 +741,6 @@
         <w:dataBinding w:prefixMappings="xmlns:ns0='http://purl.org/dc/elements/1.1/' xmlns:ns1='http://schemas.openxmlformats.org/package/2006/metadata/core-properties' " w:xpath="/ns1:coreProperties[1]/ns0:subject[1]" w:storeItemID="{6C3C8BC8-F283-45AE-878A-BAB7291924A1}"/>
         <w:text/>
       </w:sdtPr>
-      <w:sdtEndPr/>
       <w:sdtContent>
         <w:p>
           <w:pPr>
@@ -781,7 +780,6 @@
         <w:dataBinding w:prefixMappings="xmlns:ns0='http://purl.org/dc/elements/1.1/' xmlns:ns1='http://schemas.openxmlformats.org/package/2006/metadata/core-properties' " w:xpath="/ns1:coreProperties[1]/ns0:title[1]" w:storeItemID="{6C3C8BC8-F283-45AE-878A-BAB7291924A1}"/>
         <w:text/>
       </w:sdtPr>
-      <w:sdtEndPr/>
       <w:sdtContent>
         <w:p>
           <w:pPr>
@@ -889,7 +887,6 @@
                               <w:dataBinding w:prefixMappings="xmlns:ns0='http://purl.org/dc/elements/1.1/' xmlns:ns1='http://schemas.openxmlformats.org/package/2006/metadata/core-properties' " w:xpath="/ns1:coreProperties[1]/ns0:creator[1]" w:storeItemID="{6C3C8BC8-F283-45AE-878A-BAB7291924A1}"/>
                               <w:text w:multiLine="1"/>
                             </w:sdtPr>
-                            <w:sdtEndPr/>
                             <w:sdtContent>
                               <w:p>
                                 <w:pPr>
@@ -957,7 +954,6 @@
                                 <w:dataBinding w:prefixMappings="xmlns:ns0='http://purl.org/dc/elements/1.1/' xmlns:ns1='http://schemas.openxmlformats.org/package/2006/metadata/core-properties' " w:xpath="/ns1:coreProperties[1]/ns1:contentStatus[1]" w:storeItemID="{6C3C8BC8-F283-45AE-878A-BAB7291924A1}"/>
                                 <w:text/>
                               </w:sdtPr>
-                              <w:sdtEndPr/>
                               <w:sdtContent>
                                 <w:r>
                                   <w:rPr>
@@ -1013,7 +1009,6 @@
                         <w:dataBinding w:prefixMappings="xmlns:ns0='http://purl.org/dc/elements/1.1/' xmlns:ns1='http://schemas.openxmlformats.org/package/2006/metadata/core-properties' " w:xpath="/ns1:coreProperties[1]/ns0:creator[1]" w:storeItemID="{6C3C8BC8-F283-45AE-878A-BAB7291924A1}"/>
                         <w:text w:multiLine="1"/>
                       </w:sdtPr>
-                      <w:sdtEndPr/>
                       <w:sdtContent>
                         <w:p>
                           <w:pPr>
@@ -1081,7 +1076,6 @@
                           <w:dataBinding w:prefixMappings="xmlns:ns0='http://purl.org/dc/elements/1.1/' xmlns:ns1='http://schemas.openxmlformats.org/package/2006/metadata/core-properties' " w:xpath="/ns1:coreProperties[1]/ns1:contentStatus[1]" w:storeItemID="{6C3C8BC8-F283-45AE-878A-BAB7291924A1}"/>
                           <w:text/>
                         </w:sdtPr>
-                        <w:sdtEndPr/>
                         <w:sdtContent>
                           <w:r>
                             <w:rPr>
@@ -1224,7 +1218,7 @@
       <w:r>
         <w:fldChar w:fldCharType="separate"/>
       </w:r>
-      <w:hyperlink w:anchor="_Toc214970078" w:history="1">
+      <w:hyperlink w:anchor="_Toc221015697" w:history="1">
         <w:r>
           <w:rPr>
             <w:rStyle w:val="Hyperlink"/>
@@ -1265,7 +1259,7 @@
           <w:rPr>
             <w:webHidden/>
           </w:rPr>
-          <w:instrText xml:space="preserve"> PAGEREF _Toc214970078 \h </w:instrText>
+          <w:instrText xml:space="preserve"> PAGEREF _Toc221015697 \h </w:instrText>
         </w:r>
         <w:r>
           <w:rPr>
@@ -1306,7 +1300,7 @@
           <w14:ligatures w14:val="standardContextual"/>
         </w:rPr>
       </w:pPr>
-      <w:hyperlink w:anchor="_Toc214970079" w:history="1">
+      <w:hyperlink w:anchor="_Toc221015698" w:history="1">
         <w:r>
           <w:rPr>
             <w:rStyle w:val="Hyperlink"/>
@@ -1348,7 +1342,7 @@
           <w:rPr>
             <w:webHidden/>
           </w:rPr>
-          <w:instrText xml:space="preserve"> PAGEREF _Toc214970079 \h </w:instrText>
+          <w:instrText xml:space="preserve"> PAGEREF _Toc221015698 \h </w:instrText>
         </w:r>
         <w:r>
           <w:rPr>
@@ -1387,7 +1381,7 @@
           <w14:ligatures w14:val="standardContextual"/>
         </w:rPr>
       </w:pPr>
-      <w:hyperlink w:anchor="_Toc214970080" w:history="1">
+      <w:hyperlink w:anchor="_Toc221015699" w:history="1">
         <w:r>
           <w:rPr>
             <w:rStyle w:val="Hyperlink"/>
@@ -1427,7 +1421,7 @@
           <w:rPr>
             <w:webHidden/>
           </w:rPr>
-          <w:instrText xml:space="preserve"> PAGEREF _Toc214970080 \h </w:instrText>
+          <w:instrText xml:space="preserve"> PAGEREF _Toc221015699 \h </w:instrText>
         </w:r>
         <w:r>
           <w:rPr>
@@ -1466,7 +1460,7 @@
           <w14:ligatures w14:val="standardContextual"/>
         </w:rPr>
       </w:pPr>
-      <w:hyperlink w:anchor="_Toc214970081" w:history="1">
+      <w:hyperlink w:anchor="_Toc221015700" w:history="1">
         <w:r>
           <w:rPr>
             <w:rStyle w:val="Hyperlink"/>
@@ -1506,7 +1500,7 @@
           <w:rPr>
             <w:webHidden/>
           </w:rPr>
-          <w:instrText xml:space="preserve"> PAGEREF _Toc214970081 \h </w:instrText>
+          <w:instrText xml:space="preserve"> PAGEREF _Toc221015700 \h </w:instrText>
         </w:r>
         <w:r>
           <w:rPr>
@@ -1547,7 +1541,7 @@
           <w14:ligatures w14:val="standardContextual"/>
         </w:rPr>
       </w:pPr>
-      <w:hyperlink w:anchor="_Toc214970082" w:history="1">
+      <w:hyperlink w:anchor="_Toc221015701" w:history="1">
         <w:r>
           <w:rPr>
             <w:rStyle w:val="Hyperlink"/>
@@ -1589,7 +1583,7 @@
           <w:rPr>
             <w:webHidden/>
           </w:rPr>
-          <w:instrText xml:space="preserve"> PAGEREF _Toc214970082 \h </w:instrText>
+          <w:instrText xml:space="preserve"> PAGEREF _Toc221015701 \h </w:instrText>
         </w:r>
         <w:r>
           <w:rPr>
@@ -1628,7 +1622,7 @@
           <w14:ligatures w14:val="standardContextual"/>
         </w:rPr>
       </w:pPr>
-      <w:hyperlink w:anchor="_Toc214970083" w:history="1">
+      <w:hyperlink w:anchor="_Toc221015702" w:history="1">
         <w:r>
           <w:rPr>
             <w:rStyle w:val="Hyperlink"/>
@@ -1668,7 +1662,7 @@
           <w:rPr>
             <w:webHidden/>
           </w:rPr>
-          <w:instrText xml:space="preserve"> PAGEREF _Toc214970083 \h </w:instrText>
+          <w:instrText xml:space="preserve"> PAGEREF _Toc221015702 \h </w:instrText>
         </w:r>
         <w:r>
           <w:rPr>
@@ -1707,7 +1701,7 @@
           <w14:ligatures w14:val="standardContextual"/>
         </w:rPr>
       </w:pPr>
-      <w:hyperlink w:anchor="_Toc214970084" w:history="1">
+      <w:hyperlink w:anchor="_Toc221015703" w:history="1">
         <w:r>
           <w:rPr>
             <w:rStyle w:val="Hyperlink"/>
@@ -1749,7 +1743,7 @@
           <w:rPr>
             <w:webHidden/>
           </w:rPr>
-          <w:instrText xml:space="preserve"> PAGEREF _Toc214970084 \h </w:instrText>
+          <w:instrText xml:space="preserve"> PAGEREF _Toc221015703 \h </w:instrText>
         </w:r>
         <w:r>
           <w:rPr>
@@ -1788,7 +1782,7 @@
           <w14:ligatures w14:val="standardContextual"/>
         </w:rPr>
       </w:pPr>
-      <w:hyperlink w:anchor="_Toc214970085" w:history="1">
+      <w:hyperlink w:anchor="_Toc221015704" w:history="1">
         <w:r>
           <w:rPr>
             <w:rStyle w:val="Hyperlink"/>
@@ -1830,7 +1824,7 @@
           <w:rPr>
             <w:webHidden/>
           </w:rPr>
-          <w:instrText xml:space="preserve"> PAGEREF _Toc214970085 \h </w:instrText>
+          <w:instrText xml:space="preserve"> PAGEREF _Toc221015704 \h </w:instrText>
         </w:r>
         <w:r>
           <w:rPr>
@@ -1871,7 +1865,7 @@
           <w14:ligatures w14:val="standardContextual"/>
         </w:rPr>
       </w:pPr>
-      <w:hyperlink w:anchor="_Toc214970086" w:history="1">
+      <w:hyperlink w:anchor="_Toc221015705" w:history="1">
         <w:r>
           <w:rPr>
             <w:rStyle w:val="Hyperlink"/>
@@ -1915,7 +1909,7 @@
           <w:rPr>
             <w:webHidden/>
           </w:rPr>
-          <w:instrText xml:space="preserve"> PAGEREF _Toc214970086 \h </w:instrText>
+          <w:instrText xml:space="preserve"> PAGEREF _Toc221015705 \h </w:instrText>
         </w:r>
         <w:r>
           <w:rPr>
@@ -1954,7 +1948,7 @@
           <w14:ligatures w14:val="standardContextual"/>
         </w:rPr>
       </w:pPr>
-      <w:hyperlink w:anchor="_Toc214970087" w:history="1">
+      <w:hyperlink w:anchor="_Toc221015706" w:history="1">
         <w:r>
           <w:rPr>
             <w:rStyle w:val="Hyperlink"/>
@@ -1996,7 +1990,7 @@
           <w:rPr>
             <w:webHidden/>
           </w:rPr>
-          <w:instrText xml:space="preserve"> PAGEREF _Toc214970087 \h </w:instrText>
+          <w:instrText xml:space="preserve"> PAGEREF _Toc221015706 \h </w:instrText>
         </w:r>
         <w:r>
           <w:rPr>
@@ -2037,7 +2031,7 @@
           <w14:ligatures w14:val="standardContextual"/>
         </w:rPr>
       </w:pPr>
-      <w:hyperlink w:anchor="_Toc214970088" w:history="1">
+      <w:hyperlink w:anchor="_Toc221015707" w:history="1">
         <w:r>
           <w:rPr>
             <w:rStyle w:val="Hyperlink"/>
@@ -2081,7 +2075,7 @@
           <w:rPr>
             <w:webHidden/>
           </w:rPr>
-          <w:instrText xml:space="preserve"> PAGEREF _Toc214970088 \h </w:instrText>
+          <w:instrText xml:space="preserve"> PAGEREF _Toc221015707 \h </w:instrText>
         </w:r>
         <w:r>
           <w:rPr>
@@ -2120,7 +2114,7 @@
           <w14:ligatures w14:val="standardContextual"/>
         </w:rPr>
       </w:pPr>
-      <w:hyperlink w:anchor="_Toc214970089" w:history="1">
+      <w:hyperlink w:anchor="_Toc221015708" w:history="1">
         <w:r>
           <w:rPr>
             <w:rStyle w:val="Hyperlink"/>
@@ -2162,7 +2156,7 @@
           <w:rPr>
             <w:webHidden/>
           </w:rPr>
-          <w:instrText xml:space="preserve"> PAGEREF _Toc214970089 \h </w:instrText>
+          <w:instrText xml:space="preserve"> PAGEREF _Toc221015708 \h </w:instrText>
         </w:r>
         <w:r>
           <w:rPr>
@@ -2201,7 +2195,7 @@
           <w14:ligatures w14:val="standardContextual"/>
         </w:rPr>
       </w:pPr>
-      <w:hyperlink w:anchor="_Toc214970090" w:history="1">
+      <w:hyperlink w:anchor="_Toc221015709" w:history="1">
         <w:r>
           <w:rPr>
             <w:rStyle w:val="Hyperlink"/>
@@ -2243,7 +2237,7 @@
           <w:rPr>
             <w:webHidden/>
           </w:rPr>
-          <w:instrText xml:space="preserve"> PAGEREF _Toc214970090 \h </w:instrText>
+          <w:instrText xml:space="preserve"> PAGEREF _Toc221015709 \h </w:instrText>
         </w:r>
         <w:r>
           <w:rPr>
@@ -2283,7 +2277,7 @@
           <w14:ligatures w14:val="standardContextual"/>
         </w:rPr>
       </w:pPr>
-      <w:hyperlink w:anchor="_Toc214970091" w:history="1">
+      <w:hyperlink w:anchor="_Toc221015710" w:history="1">
         <w:r>
           <w:rPr>
             <w:rStyle w:val="Hyperlink"/>
@@ -2324,7 +2318,7 @@
           <w:rPr>
             <w:webHidden/>
           </w:rPr>
-          <w:instrText xml:space="preserve"> PAGEREF _Toc214970091 \h </w:instrText>
+          <w:instrText xml:space="preserve"> PAGEREF _Toc221015710 \h </w:instrText>
         </w:r>
         <w:r>
           <w:rPr>
@@ -2365,7 +2359,7 @@
           <w14:ligatures w14:val="standardContextual"/>
         </w:rPr>
       </w:pPr>
-      <w:hyperlink w:anchor="_Toc214970092" w:history="1">
+      <w:hyperlink w:anchor="_Toc221015711" w:history="1">
         <w:r>
           <w:rPr>
             <w:rStyle w:val="Hyperlink"/>
@@ -2407,7 +2401,7 @@
           <w:rPr>
             <w:webHidden/>
           </w:rPr>
-          <w:instrText xml:space="preserve"> PAGEREF _Toc214970092 \h </w:instrText>
+          <w:instrText xml:space="preserve"> PAGEREF _Toc221015711 \h </w:instrText>
         </w:r>
         <w:r>
           <w:rPr>
@@ -2448,7 +2442,7 @@
           <w14:ligatures w14:val="standardContextual"/>
         </w:rPr>
       </w:pPr>
-      <w:hyperlink w:anchor="_Toc214970093" w:history="1">
+      <w:hyperlink w:anchor="_Toc221015712" w:history="1">
         <w:r>
           <w:rPr>
             <w:rStyle w:val="Hyperlink"/>
@@ -2490,7 +2484,7 @@
           <w:rPr>
             <w:webHidden/>
           </w:rPr>
-          <w:instrText xml:space="preserve"> PAGEREF _Toc214970093 \h </w:instrText>
+          <w:instrText xml:space="preserve"> PAGEREF _Toc221015712 \h </w:instrText>
         </w:r>
         <w:r>
           <w:rPr>
@@ -2531,7 +2525,7 @@
           <w14:ligatures w14:val="standardContextual"/>
         </w:rPr>
       </w:pPr>
-      <w:hyperlink w:anchor="_Toc214970094" w:history="1">
+      <w:hyperlink w:anchor="_Toc221015713" w:history="1">
         <w:r>
           <w:rPr>
             <w:rStyle w:val="Hyperlink"/>
@@ -2573,7 +2567,7 @@
           <w:rPr>
             <w:webHidden/>
           </w:rPr>
-          <w:instrText xml:space="preserve"> PAGEREF _Toc214970094 \h </w:instrText>
+          <w:instrText xml:space="preserve"> PAGEREF _Toc221015713 \h </w:instrText>
         </w:r>
         <w:r>
           <w:rPr>
@@ -2609,7 +2603,7 @@
         <w:fldChar w:fldCharType="end"/>
       </w:r>
     </w:p>
-    <w:bookmarkStart w:id="0" w:name="_Toc214970078"/>
+    <w:bookmarkStart w:id="0" w:name="_Toc221015697"/>
     <w:p>
       <w:pPr>
         <w:pStyle w:val="berschrift1"/>
@@ -2836,7 +2830,7 @@
       <w:pPr>
         <w:pStyle w:val="berschrift2"/>
       </w:pPr>
-      <w:bookmarkStart w:id="1" w:name="_Toc214970079"/>
+      <w:bookmarkStart w:id="1" w:name="_Toc221015698"/>
       <w:r>
         <w:t>Informieren</w:t>
       </w:r>
@@ -2846,7 +2840,7 @@
       <w:pPr>
         <w:pStyle w:val="berschrift3"/>
       </w:pPr>
-      <w:bookmarkStart w:id="2" w:name="_Toc214970080"/>
+      <w:bookmarkStart w:id="2" w:name="_Toc221015699"/>
       <w:r>
         <w:t>Komponenten Beschreibung</w:t>
       </w:r>
@@ -5344,7 +5338,7 @@
       <w:pPr>
         <w:pStyle w:val="berschrift3"/>
       </w:pPr>
-      <w:bookmarkStart w:id="23" w:name="_Toc214970081"/>
+      <w:bookmarkStart w:id="23" w:name="_Toc221015700"/>
       <w:r>
         <w:t>Ab wann ist die Luftqualität schlecht?</w:t>
       </w:r>
@@ -5632,7 +5626,7 @@
       <w:pPr>
         <w:pStyle w:val="berschrift2"/>
       </w:pPr>
-      <w:bookmarkStart w:id="26" w:name="_Toc214970082"/>
+      <w:bookmarkStart w:id="26" w:name="_Toc221015701"/>
       <w:r>
         <w:lastRenderedPageBreak/>
         <w:t>Planen</w:t>
@@ -5646,7 +5640,7 @@
       <w:pPr>
         <w:pStyle w:val="berschrift3"/>
       </w:pPr>
-      <w:bookmarkStart w:id="27" w:name="_Toc214970083"/>
+      <w:bookmarkStart w:id="27" w:name="_Toc221015702"/>
       <w:r>
         <w:t>Verkabelungen</w:t>
       </w:r>
@@ -5669,7 +5663,7 @@
           <w:noProof/>
         </w:rPr>
         <w:drawing>
-          <wp:anchor distT="0" distB="0" distL="114300" distR="114300" simplePos="0" relativeHeight="251769856" behindDoc="0" locked="0" layoutInCell="1" allowOverlap="1" wp14:anchorId="5DA10DA6" wp14:editId="7F1567DF">
+          <wp:anchor distT="0" distB="0" distL="114300" distR="114300" simplePos="0" relativeHeight="251769856" behindDoc="0" locked="0" layoutInCell="1" allowOverlap="1" wp14:anchorId="5DA10DA6" wp14:editId="65BEF4D0">
             <wp:simplePos x="0" y="0"/>
             <wp:positionH relativeFrom="margin">
               <wp:posOffset>-86360</wp:posOffset>
@@ -6135,7 +6129,7 @@
           <w:lang w:eastAsia="de-CH"/>
         </w:rPr>
       </w:pPr>
-      <w:bookmarkStart w:id="32" w:name="_Toc214970084"/>
+      <w:bookmarkStart w:id="32" w:name="_Toc221015703"/>
       <w:r>
         <w:rPr>
           <w:lang w:eastAsia="de-CH"/>
@@ -6813,7 +6807,7 @@
           <w:lang w:eastAsia="de-CH"/>
         </w:rPr>
         <w:drawing>
-          <wp:anchor distT="0" distB="0" distL="114300" distR="114300" simplePos="0" relativeHeight="251811840" behindDoc="0" locked="0" layoutInCell="1" allowOverlap="1" wp14:anchorId="6E8AB879" wp14:editId="4EB7DFE6">
+          <wp:anchor distT="0" distB="0" distL="114300" distR="114300" simplePos="0" relativeHeight="251811840" behindDoc="0" locked="0" layoutInCell="1" allowOverlap="1" wp14:anchorId="6E8AB879" wp14:editId="2D09A300">
             <wp:simplePos x="0" y="0"/>
             <wp:positionH relativeFrom="margin">
               <wp:posOffset>-304800</wp:posOffset>
@@ -7581,7 +7575,7 @@
           <w:lang w:eastAsia="de-CH"/>
         </w:rPr>
         <w:drawing>
-          <wp:anchor distT="0" distB="0" distL="114300" distR="114300" simplePos="0" relativeHeight="251820032" behindDoc="0" locked="0" layoutInCell="1" allowOverlap="1" wp14:anchorId="382A7A6C" wp14:editId="768B07D1">
+          <wp:anchor distT="0" distB="0" distL="114300" distR="114300" simplePos="0" relativeHeight="251820032" behindDoc="0" locked="0" layoutInCell="1" allowOverlap="1" wp14:anchorId="382A7A6C" wp14:editId="223381DC">
             <wp:simplePos x="0" y="0"/>
             <wp:positionH relativeFrom="margin">
               <wp:posOffset>-288611</wp:posOffset>
@@ -7651,7 +7645,7 @@
           <w:lang w:eastAsia="de-CH"/>
         </w:rPr>
         <w:drawing>
-          <wp:anchor distT="0" distB="0" distL="114300" distR="114300" simplePos="0" relativeHeight="251819008" behindDoc="0" locked="0" layoutInCell="1" allowOverlap="1" wp14:anchorId="574DC117" wp14:editId="55FA1882">
+          <wp:anchor distT="0" distB="0" distL="114300" distR="114300" simplePos="0" relativeHeight="251819008" behindDoc="0" locked="0" layoutInCell="1" allowOverlap="1" wp14:anchorId="574DC117" wp14:editId="6A92F0F9">
             <wp:simplePos x="0" y="0"/>
             <wp:positionH relativeFrom="column">
               <wp:posOffset>-318135</wp:posOffset>
@@ -8009,7 +8003,7 @@
         </w:rPr>
         <w:lastRenderedPageBreak/>
         <w:drawing>
-          <wp:anchor distT="0" distB="0" distL="114300" distR="114300" simplePos="0" relativeHeight="251802624" behindDoc="0" locked="0" layoutInCell="1" allowOverlap="1" wp14:anchorId="26C37EF2" wp14:editId="14D54D10">
+          <wp:anchor distT="0" distB="0" distL="114300" distR="114300" simplePos="0" relativeHeight="251802624" behindDoc="0" locked="0" layoutInCell="1" allowOverlap="1" wp14:anchorId="26C37EF2" wp14:editId="71371E51">
             <wp:simplePos x="0" y="0"/>
             <wp:positionH relativeFrom="margin">
               <wp:posOffset>-455711</wp:posOffset>
@@ -8875,7 +8869,7 @@
           <w:lang w:eastAsia="de-CH"/>
         </w:rPr>
         <w:drawing>
-          <wp:anchor distT="0" distB="0" distL="114300" distR="114300" simplePos="0" relativeHeight="251803648" behindDoc="0" locked="0" layoutInCell="1" allowOverlap="1" wp14:anchorId="713BF067" wp14:editId="63FA4FD3">
+          <wp:anchor distT="0" distB="0" distL="114300" distR="114300" simplePos="0" relativeHeight="251803648" behindDoc="0" locked="0" layoutInCell="1" allowOverlap="1" wp14:anchorId="713BF067" wp14:editId="4CA1AB58">
             <wp:simplePos x="0" y="0"/>
             <wp:positionH relativeFrom="margin">
               <wp:posOffset>-502821</wp:posOffset>
@@ -9503,7 +9497,7 @@
           <w:lang w:eastAsia="de-CH"/>
         </w:rPr>
       </w:pPr>
-      <w:bookmarkStart w:id="51" w:name="_Toc214970085"/>
+      <w:bookmarkStart w:id="51" w:name="_Toc221015704"/>
       <w:r>
         <w:rPr>
           <w:lang w:eastAsia="de-CH"/>
@@ -10488,7 +10482,7 @@
           <w:lang w:eastAsia="de-CH"/>
         </w:rPr>
       </w:pPr>
-      <w:bookmarkStart w:id="58" w:name="_Toc214970086"/>
+      <w:bookmarkStart w:id="58" w:name="_Toc221015705"/>
       <w:r>
         <w:rPr>
           <w:lang w:eastAsia="de-CH"/>
@@ -10505,7 +10499,7 @@
           <w:lang w:eastAsia="de-CH"/>
         </w:rPr>
       </w:pPr>
-      <w:bookmarkStart w:id="59" w:name="_Toc214970087"/>
+      <w:bookmarkStart w:id="59" w:name="_Toc221015706"/>
       <w:r>
         <w:rPr>
           <w:lang w:eastAsia="de-CH"/>
@@ -10526,7 +10520,7 @@
           <w:lang w:eastAsia="de-CH"/>
         </w:rPr>
         <w:drawing>
-          <wp:anchor distT="0" distB="0" distL="114300" distR="114300" simplePos="0" relativeHeight="251798528" behindDoc="0" locked="0" layoutInCell="1" allowOverlap="1" wp14:anchorId="1031F8AC" wp14:editId="32D9AE23">
+          <wp:anchor distT="0" distB="0" distL="114300" distR="114300" simplePos="0" relativeHeight="251798528" behindDoc="0" locked="0" layoutInCell="1" allowOverlap="1" wp14:anchorId="1031F8AC" wp14:editId="1F95B085">
             <wp:simplePos x="0" y="0"/>
             <wp:positionH relativeFrom="margin">
               <wp:align>left</wp:align>
@@ -10725,7 +10719,7 @@
           <w:lang w:eastAsia="de-CH"/>
         </w:rPr>
       </w:pPr>
-      <w:bookmarkStart w:id="62" w:name="_Toc214970088"/>
+      <w:bookmarkStart w:id="62" w:name="_Toc221015707"/>
       <w:r>
         <w:rPr>
           <w:lang w:eastAsia="de-CH"/>
@@ -10741,7 +10735,7 @@
           <w:lang w:eastAsia="de-CH"/>
         </w:rPr>
       </w:pPr>
-      <w:bookmarkStart w:id="63" w:name="_Toc214970089"/>
+      <w:bookmarkStart w:id="63" w:name="_Toc221015708"/>
       <w:r>
         <w:rPr>
           <w:lang w:eastAsia="de-CH"/>
@@ -11248,7 +11242,7 @@
           <w:lang w:eastAsia="de-CH"/>
         </w:rPr>
       </w:pPr>
-      <w:bookmarkStart w:id="66" w:name="_Toc214970090"/>
+      <w:bookmarkStart w:id="66" w:name="_Toc221015709"/>
       <w:r>
         <w:rPr>
           <w:lang w:eastAsia="de-CH"/>
@@ -13125,13 +13119,191 @@
         <mc:AlternateContent>
           <mc:Choice Requires="wps">
             <w:drawing>
-              <wp:anchor distT="0" distB="0" distL="114300" distR="114300" simplePos="0" relativeHeight="251865088" behindDoc="1" locked="0" layoutInCell="1" allowOverlap="1" wp14:anchorId="4A50AE92" wp14:editId="7F0C4776">
+              <wp:anchor distT="0" distB="0" distL="114300" distR="114300" simplePos="0" relativeHeight="251867136" behindDoc="0" locked="0" layoutInCell="1" allowOverlap="1" wp14:anchorId="03ACFA5C" wp14:editId="0693367A">
+                <wp:simplePos x="0" y="0"/>
+                <wp:positionH relativeFrom="margin">
+                  <wp:align>left</wp:align>
+                </wp:positionH>
+                <wp:positionV relativeFrom="paragraph">
+                  <wp:posOffset>6193246</wp:posOffset>
+                </wp:positionV>
+                <wp:extent cx="2835910" cy="263525"/>
+                <wp:effectExtent l="0" t="0" r="0" b="3175"/>
+                <wp:wrapNone/>
+                <wp:docPr id="407037508" name="Textfeld 20"/>
+                <wp:cNvGraphicFramePr/>
+                <a:graphic xmlns:a="http://schemas.openxmlformats.org/drawingml/2006/main">
+                  <a:graphicData uri="http://schemas.microsoft.com/office/word/2010/wordprocessingShape">
+                    <wps:wsp>
+                      <wps:cNvSpPr txBox="1"/>
+                      <wps:spPr>
+                        <a:xfrm>
+                          <a:off x="0" y="0"/>
+                          <a:ext cx="2835910" cy="263525"/>
+                        </a:xfrm>
+                        <a:prstGeom prst="rect">
+                          <a:avLst/>
+                        </a:prstGeom>
+                        <a:noFill/>
+                        <a:ln w="6350">
+                          <a:noFill/>
+                        </a:ln>
+                      </wps:spPr>
+                      <wps:txbx>
+                        <w:txbxContent>
+                          <w:p>
+                            <w:pPr>
+                              <w:pStyle w:val="Beschriftung"/>
+                            </w:pPr>
+                            <w:bookmarkStart w:id="79" w:name="_Toc214970499"/>
+                            <w:r>
+                              <w:t xml:space="preserve">Abbildung </w:t>
+                            </w:r>
+                            <w:r>
+                              <w:t>32</w:t>
+                            </w:r>
+                            <w:r>
+                              <w:t xml:space="preserve"> – </w:t>
+                            </w:r>
+                            <w:r>
+                              <w:t>manageMenu()</w:t>
+                            </w:r>
+                            <w:bookmarkEnd w:id="79"/>
+                          </w:p>
+                        </w:txbxContent>
+                      </wps:txbx>
+                      <wps:bodyPr rot="0" spcFirstLastPara="0" vertOverflow="overflow" horzOverflow="overflow" vert="horz" wrap="square" lIns="91440" tIns="45720" rIns="91440" bIns="45720" numCol="1" spcCol="0" rtlCol="0" fromWordArt="0" anchor="t" anchorCtr="0" forceAA="0" compatLnSpc="1">
+                        <a:prstTxWarp prst="textNoShape">
+                          <a:avLst/>
+                        </a:prstTxWarp>
+                        <a:noAutofit/>
+                      </wps:bodyPr>
+                    </wps:wsp>
+                  </a:graphicData>
+                </a:graphic>
+                <wp14:sizeRelH relativeFrom="margin">
+                  <wp14:pctWidth>0</wp14:pctWidth>
+                </wp14:sizeRelH>
+                <wp14:sizeRelV relativeFrom="margin">
+                  <wp14:pctHeight>0</wp14:pctHeight>
+                </wp14:sizeRelV>
+              </wp:anchor>
+            </w:drawing>
+          </mc:Choice>
+          <mc:Fallback>
+            <w:pict>
+              <v:shape w14:anchorId="03ACFA5C" id="_x0000_s1074" type="#_x0000_t202" style="position:absolute;margin-left:0;margin-top:487.65pt;width:223.3pt;height:20.75pt;z-index:251867136;visibility:visible;mso-wrap-style:square;mso-width-percent:0;mso-height-percent:0;mso-wrap-distance-left:9pt;mso-wrap-distance-top:0;mso-wrap-distance-right:9pt;mso-wrap-distance-bottom:0;mso-position-horizontal:left;mso-position-horizontal-relative:margin;mso-position-vertical:absolute;mso-position-vertical-relative:text;mso-width-percent:0;mso-height-percent:0;mso-width-relative:margin;mso-height-relative:margin;v-text-anchor:top" o:gfxdata="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" filled="f" stroked="f" strokeweight=".5pt">
+                <v:textbox>
+                  <w:txbxContent>
+                    <w:p>
+                      <w:pPr>
+                        <w:pStyle w:val="Beschriftung"/>
+                      </w:pPr>
+                      <w:bookmarkStart w:id="80" w:name="_Toc214970499"/>
+                      <w:r>
+                        <w:t xml:space="preserve">Abbildung </w:t>
+                      </w:r>
+                      <w:r>
+                        <w:t>32</w:t>
+                      </w:r>
+                      <w:r>
+                        <w:t xml:space="preserve"> – </w:t>
+                      </w:r>
+                      <w:r>
+                        <w:t>manageMenu()</w:t>
+                      </w:r>
+                      <w:bookmarkEnd w:id="80"/>
+                    </w:p>
+                  </w:txbxContent>
+                </v:textbox>
+                <w10:wrap anchorx="margin"/>
+              </v:shape>
+            </w:pict>
+          </mc:Fallback>
+        </mc:AlternateContent>
+      </w:r>
+      <w:r>
+        <w:rPr>
+          <w:noProof/>
+        </w:rPr>
+        <w:drawing>
+          <wp:anchor distT="0" distB="0" distL="114300" distR="114300" simplePos="0" relativeHeight="251864064" behindDoc="0" locked="0" layoutInCell="1" allowOverlap="1" wp14:anchorId="34B44A50" wp14:editId="5A9BBB0C">
+            <wp:simplePos x="0" y="0"/>
+            <wp:positionH relativeFrom="margin">
+              <wp:posOffset>14514</wp:posOffset>
+            </wp:positionH>
+            <wp:positionV relativeFrom="paragraph">
+              <wp:posOffset>2171247</wp:posOffset>
+            </wp:positionV>
+            <wp:extent cx="1796415" cy="3988435"/>
+            <wp:effectExtent l="0" t="0" r="0" b="0"/>
+            <wp:wrapThrough wrapText="bothSides">
+              <wp:wrapPolygon edited="0">
+                <wp:start x="0" y="0"/>
+                <wp:lineTo x="0" y="21459"/>
+                <wp:lineTo x="21302" y="21459"/>
+                <wp:lineTo x="21302" y="0"/>
+                <wp:lineTo x="0" y="0"/>
+              </wp:wrapPolygon>
+            </wp:wrapThrough>
+            <wp:docPr id="1259198393" name="Grafik 1"/>
+            <wp:cNvGraphicFramePr>
+              <a:graphicFrameLocks xmlns:a="http://schemas.openxmlformats.org/drawingml/2006/main" noChangeAspect="1"/>
+            </wp:cNvGraphicFramePr>
+            <a:graphic xmlns:a="http://schemas.openxmlformats.org/drawingml/2006/main">
+              <a:graphicData uri="http://schemas.openxmlformats.org/drawingml/2006/picture">
+                <pic:pic xmlns:pic="http://schemas.openxmlformats.org/drawingml/2006/picture">
+                  <pic:nvPicPr>
+                    <pic:cNvPr id="1259198393" name="Grafik 1"/>
+                    <pic:cNvPicPr/>
+                  </pic:nvPicPr>
+                  <pic:blipFill>
+                    <a:blip r:embed="rId45">
+                      <a:extLst>
+                        <a:ext uri="{28A0092B-C50C-407E-A947-70E740481C1C}">
+                          <a14:useLocalDpi xmlns:a14="http://schemas.microsoft.com/office/drawing/2010/main" val="0"/>
+                        </a:ext>
+                      </a:extLst>
+                    </a:blip>
+                    <a:stretch>
+                      <a:fillRect/>
+                    </a:stretch>
+                  </pic:blipFill>
+                  <pic:spPr>
+                    <a:xfrm>
+                      <a:off x="0" y="0"/>
+                      <a:ext cx="1796415" cy="3988435"/>
+                    </a:xfrm>
+                    <a:prstGeom prst="rect">
+                      <a:avLst/>
+                    </a:prstGeom>
+                  </pic:spPr>
+                </pic:pic>
+              </a:graphicData>
+            </a:graphic>
+            <wp14:sizeRelH relativeFrom="margin">
+              <wp14:pctWidth>0</wp14:pctWidth>
+            </wp14:sizeRelH>
+            <wp14:sizeRelV relativeFrom="margin">
+              <wp14:pctHeight>0</wp14:pctHeight>
+            </wp14:sizeRelV>
+          </wp:anchor>
+        </w:drawing>
+      </w:r>
+      <w:r>
+        <w:rPr>
+          <w:noProof/>
+        </w:rPr>
+        <mc:AlternateContent>
+          <mc:Choice Requires="wps">
+            <w:drawing>
+              <wp:anchor distT="0" distB="0" distL="114300" distR="114300" simplePos="0" relativeHeight="251865088" behindDoc="1" locked="0" layoutInCell="1" allowOverlap="1" wp14:anchorId="4A50AE92" wp14:editId="45372BCC">
                 <wp:simplePos x="0" y="0"/>
                 <wp:positionH relativeFrom="column">
-                  <wp:posOffset>2825115</wp:posOffset>
+                  <wp:posOffset>1874066</wp:posOffset>
                 </wp:positionH>
                 <wp:positionV relativeFrom="paragraph">
-                  <wp:posOffset>2620645</wp:posOffset>
+                  <wp:posOffset>2656568</wp:posOffset>
                 </wp:positionV>
                 <wp:extent cx="3657600" cy="3138170"/>
                 <wp:effectExtent l="0" t="0" r="0" b="5080"/>
@@ -13172,7 +13344,10 @@
                           </w:p>
                           <w:p>
                             <w:r>
-                              <w:t>Einfach erklärt, wird erst geprüft</w:t>
+                              <w:t xml:space="preserve">Es wird </w:t>
+                            </w:r>
+                            <w:r>
+                              <w:t>erst geprüft</w:t>
                             </w:r>
                             <w:r>
                               <w:t>, ob der Knopf geklickt</w:t>
@@ -13244,7 +13419,7 @@
           </mc:Choice>
           <mc:Fallback>
             <w:pict>
-              <v:shape w14:anchorId="4A50AE92" id="Textfeld 55" o:spid="_x0000_s1074" type="#_x0000_t202" style="position:absolute;margin-left:222.45pt;margin-top:206.35pt;width:4in;height:247.1pt;z-index:-251451392;visibility:visible;mso-wrap-style:square;mso-width-percent:0;mso-wrap-distance-left:9pt;mso-wrap-distance-top:0;mso-wrap-distance-right:9pt;mso-wrap-distance-bottom:0;mso-position-horizontal:absolute;mso-position-horizontal-relative:text;mso-position-vertical:absolute;mso-position-vertical-relative:text;mso-width-percent:0;mso-width-relative:margin;v-text-anchor:top" o:gfxdata="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" filled="f" stroked="f" strokeweight=".5pt">
+              <v:shape w14:anchorId="4A50AE92" id="Textfeld 55" o:spid="_x0000_s1075" type="#_x0000_t202" style="position:absolute;margin-left:147.55pt;margin-top:209.2pt;width:4in;height:247.1pt;z-index:-251451392;visibility:visible;mso-wrap-style:square;mso-width-percent:0;mso-wrap-distance-left:9pt;mso-wrap-distance-top:0;mso-wrap-distance-right:9pt;mso-wrap-distance-bottom:0;mso-position-horizontal:absolute;mso-position-horizontal-relative:text;mso-position-vertical:absolute;mso-position-vertical-relative:text;mso-width-percent:0;mso-width-relative:margin;v-text-anchor:top" o:gfxdata="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" filled="f" stroked="f" strokeweight=".5pt">
                 <v:textbox>
                   <w:txbxContent>
                     <w:p>
@@ -13254,7 +13429,10 @@
                     </w:p>
                     <w:p>
                       <w:r>
-                        <w:t>Einfach erklärt, wird erst geprüft</w:t>
+                        <w:t xml:space="preserve">Es wird </w:t>
+                      </w:r>
+                      <w:r>
+                        <w:t>erst geprüft</w:t>
                       </w:r>
                       <w:r>
                         <w:t>, ob der Knopf geklickt</w:t>
@@ -13322,117 +13500,7 @@
         <mc:AlternateContent>
           <mc:Choice Requires="wps">
             <w:drawing>
-              <wp:anchor distT="0" distB="0" distL="114300" distR="114300" simplePos="0" relativeHeight="251867136" behindDoc="0" locked="0" layoutInCell="1" allowOverlap="1" wp14:anchorId="03ACFA5C" wp14:editId="2F702E9C">
-                <wp:simplePos x="0" y="0"/>
-                <wp:positionH relativeFrom="margin">
-                  <wp:align>left</wp:align>
-                </wp:positionH>
-                <wp:positionV relativeFrom="paragraph">
-                  <wp:posOffset>5809158</wp:posOffset>
-                </wp:positionV>
-                <wp:extent cx="2835910" cy="263525"/>
-                <wp:effectExtent l="0" t="0" r="0" b="3175"/>
-                <wp:wrapNone/>
-                <wp:docPr id="407037508" name="Textfeld 20"/>
-                <wp:cNvGraphicFramePr/>
-                <a:graphic xmlns:a="http://schemas.openxmlformats.org/drawingml/2006/main">
-                  <a:graphicData uri="http://schemas.microsoft.com/office/word/2010/wordprocessingShape">
-                    <wps:wsp>
-                      <wps:cNvSpPr txBox="1"/>
-                      <wps:spPr>
-                        <a:xfrm>
-                          <a:off x="0" y="0"/>
-                          <a:ext cx="2835910" cy="263525"/>
-                        </a:xfrm>
-                        <a:prstGeom prst="rect">
-                          <a:avLst/>
-                        </a:prstGeom>
-                        <a:noFill/>
-                        <a:ln w="6350">
-                          <a:noFill/>
-                        </a:ln>
-                      </wps:spPr>
-                      <wps:txbx>
-                        <w:txbxContent>
-                          <w:p>
-                            <w:pPr>
-                              <w:pStyle w:val="Beschriftung"/>
-                            </w:pPr>
-                            <w:bookmarkStart w:id="79" w:name="_Toc214970499"/>
-                            <w:r>
-                              <w:t xml:space="preserve">Abbildung </w:t>
-                            </w:r>
-                            <w:r>
-                              <w:t>32</w:t>
-                            </w:r>
-                            <w:r>
-                              <w:t xml:space="preserve"> – </w:t>
-                            </w:r>
-                            <w:r>
-                              <w:t>manageMenu()</w:t>
-                            </w:r>
-                            <w:bookmarkEnd w:id="79"/>
-                          </w:p>
-                        </w:txbxContent>
-                      </wps:txbx>
-                      <wps:bodyPr rot="0" spcFirstLastPara="0" vertOverflow="overflow" horzOverflow="overflow" vert="horz" wrap="square" lIns="91440" tIns="45720" rIns="91440" bIns="45720" numCol="1" spcCol="0" rtlCol="0" fromWordArt="0" anchor="t" anchorCtr="0" forceAA="0" compatLnSpc="1">
-                        <a:prstTxWarp prst="textNoShape">
-                          <a:avLst/>
-                        </a:prstTxWarp>
-                        <a:noAutofit/>
-                      </wps:bodyPr>
-                    </wps:wsp>
-                  </a:graphicData>
-                </a:graphic>
-                <wp14:sizeRelH relativeFrom="margin">
-                  <wp14:pctWidth>0</wp14:pctWidth>
-                </wp14:sizeRelH>
-                <wp14:sizeRelV relativeFrom="margin">
-                  <wp14:pctHeight>0</wp14:pctHeight>
-                </wp14:sizeRelV>
-              </wp:anchor>
-            </w:drawing>
-          </mc:Choice>
-          <mc:Fallback>
-            <w:pict>
-              <v:shape w14:anchorId="03ACFA5C" id="_x0000_s1075" type="#_x0000_t202" style="position:absolute;margin-left:0;margin-top:457.4pt;width:223.3pt;height:20.75pt;z-index:251867136;visibility:visible;mso-wrap-style:square;mso-width-percent:0;mso-height-percent:0;mso-wrap-distance-left:9pt;mso-wrap-distance-top:0;mso-wrap-distance-right:9pt;mso-wrap-distance-bottom:0;mso-position-horizontal:left;mso-position-horizontal-relative:margin;mso-position-vertical:absolute;mso-position-vertical-relative:text;mso-width-percent:0;mso-height-percent:0;mso-width-relative:margin;mso-height-relative:margin;v-text-anchor:top" o:gfxdata="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" filled="f" stroked="f" strokeweight=".5pt">
-                <v:textbox>
-                  <w:txbxContent>
-                    <w:p>
-                      <w:pPr>
-                        <w:pStyle w:val="Beschriftung"/>
-                      </w:pPr>
-                      <w:bookmarkStart w:id="80" w:name="_Toc214970499"/>
-                      <w:r>
-                        <w:t xml:space="preserve">Abbildung </w:t>
-                      </w:r>
-                      <w:r>
-                        <w:t>32</w:t>
-                      </w:r>
-                      <w:r>
-                        <w:t xml:space="preserve"> – </w:t>
-                      </w:r>
-                      <w:r>
-                        <w:t>manageMenu()</w:t>
-                      </w:r>
-                      <w:bookmarkEnd w:id="80"/>
-                    </w:p>
-                  </w:txbxContent>
-                </v:textbox>
-                <w10:wrap anchorx="margin"/>
-              </v:shape>
-            </w:pict>
-          </mc:Fallback>
-        </mc:AlternateContent>
-      </w:r>
-      <w:r>
-        <w:rPr>
-          <w:noProof/>
-        </w:rPr>
-        <mc:AlternateContent>
-          <mc:Choice Requires="wps">
-            <w:drawing>
-              <wp:anchor distT="0" distB="0" distL="114300" distR="114300" simplePos="0" relativeHeight="251863040" behindDoc="0" locked="0" layoutInCell="1" allowOverlap="1" wp14:anchorId="2093081D" wp14:editId="49E656B2">
+              <wp:anchor distT="0" distB="0" distL="114300" distR="114300" simplePos="0" relativeHeight="251863040" behindDoc="0" locked="0" layoutInCell="1" allowOverlap="1" wp14:anchorId="2093081D" wp14:editId="3AABFA8D">
                 <wp:simplePos x="0" y="0"/>
                 <wp:positionH relativeFrom="column">
                   <wp:posOffset>4273702</wp:posOffset>
@@ -13554,72 +13622,10 @@
         <w:rPr>
           <w:noProof/>
         </w:rPr>
-        <w:drawing>
-          <wp:anchor distT="0" distB="0" distL="114300" distR="114300" simplePos="0" relativeHeight="251864064" behindDoc="0" locked="0" layoutInCell="1" allowOverlap="1" wp14:anchorId="34B44A50" wp14:editId="45FB310D">
-            <wp:simplePos x="0" y="0"/>
-            <wp:positionH relativeFrom="margin">
-              <wp:align>left</wp:align>
-            </wp:positionH>
-            <wp:positionV relativeFrom="paragraph">
-              <wp:posOffset>2605989</wp:posOffset>
-            </wp:positionV>
-            <wp:extent cx="2731770" cy="3167380"/>
-            <wp:effectExtent l="0" t="0" r="0" b="0"/>
-            <wp:wrapThrough wrapText="bothSides">
-              <wp:wrapPolygon edited="0">
-                <wp:start x="0" y="0"/>
-                <wp:lineTo x="0" y="21435"/>
-                <wp:lineTo x="21389" y="21435"/>
-                <wp:lineTo x="21389" y="0"/>
-                <wp:lineTo x="0" y="0"/>
-              </wp:wrapPolygon>
-            </wp:wrapThrough>
-            <wp:docPr id="1259198393" name="Grafik 1" descr="Ein Bild, das Text, Screenshot, Schrift enthält.&#10;&#10;KI-generierte Inhalte können fehlerhaft sein."/>
-            <wp:cNvGraphicFramePr>
-              <a:graphicFrameLocks xmlns:a="http://schemas.openxmlformats.org/drawingml/2006/main" noChangeAspect="1"/>
-            </wp:cNvGraphicFramePr>
-            <a:graphic xmlns:a="http://schemas.openxmlformats.org/drawingml/2006/main">
-              <a:graphicData uri="http://schemas.openxmlformats.org/drawingml/2006/picture">
-                <pic:pic xmlns:pic="http://schemas.openxmlformats.org/drawingml/2006/picture">
-                  <pic:nvPicPr>
-                    <pic:cNvPr id="1259198393" name="Grafik 1" descr="Ein Bild, das Text, Screenshot, Schrift enthält.&#10;&#10;KI-generierte Inhalte können fehlerhaft sein."/>
-                    <pic:cNvPicPr/>
-                  </pic:nvPicPr>
-                  <pic:blipFill>
-                    <a:blip r:embed="rId45">
-                      <a:extLst>
-                        <a:ext uri="{28A0092B-C50C-407E-A947-70E740481C1C}">
-                          <a14:useLocalDpi xmlns:a14="http://schemas.microsoft.com/office/drawing/2010/main" val="0"/>
-                        </a:ext>
-                      </a:extLst>
-                    </a:blip>
-                    <a:stretch>
-                      <a:fillRect/>
-                    </a:stretch>
-                  </pic:blipFill>
-                  <pic:spPr>
-                    <a:xfrm>
-                      <a:off x="0" y="0"/>
-                      <a:ext cx="2731770" cy="3167380"/>
-                    </a:xfrm>
-                    <a:prstGeom prst="rect">
-                      <a:avLst/>
-                    </a:prstGeom>
-                  </pic:spPr>
-                </pic:pic>
-              </a:graphicData>
-            </a:graphic>
-          </wp:anchor>
-        </w:drawing>
-      </w:r>
-      <w:r>
-        <w:rPr>
-          <w:noProof/>
-        </w:rPr>
         <mc:AlternateContent>
           <mc:Choice Requires="wps">
             <w:drawing>
-              <wp:anchor distT="0" distB="0" distL="114300" distR="114300" simplePos="0" relativeHeight="251862016" behindDoc="0" locked="0" layoutInCell="1" allowOverlap="1" wp14:anchorId="6E5D1D4E" wp14:editId="0F674C35">
+              <wp:anchor distT="0" distB="0" distL="114300" distR="114300" simplePos="0" relativeHeight="251862016" behindDoc="0" locked="0" layoutInCell="1" allowOverlap="1" wp14:anchorId="6E5D1D4E" wp14:editId="204975A2">
                 <wp:simplePos x="0" y="0"/>
                 <wp:positionH relativeFrom="margin">
                   <wp:align>left</wp:align>
@@ -13779,7 +13785,7 @@
       <w:pPr>
         <w:pStyle w:val="berschrift1"/>
       </w:pPr>
-      <w:bookmarkStart w:id="83" w:name="_Toc214970091"/>
+      <w:bookmarkStart w:id="83" w:name="_Toc221015710"/>
       <w:r>
         <w:lastRenderedPageBreak/>
         <w:t>Verzeichnisse</w:t>
@@ -13797,7 +13803,7 @@
         <w:pStyle w:val="berschrift2"/>
       </w:pPr>
       <w:bookmarkStart w:id="84" w:name="_Toc117236043"/>
-      <w:bookmarkStart w:id="85" w:name="_Toc214970092"/>
+      <w:bookmarkStart w:id="85" w:name="_Toc221015711"/>
       <w:r>
         <w:t>Abbildungen</w:t>
       </w:r>
@@ -16204,7 +16210,7 @@
       <w:pPr>
         <w:pStyle w:val="berschrift2"/>
       </w:pPr>
-      <w:bookmarkStart w:id="87" w:name="_Toc214970093"/>
+      <w:bookmarkStart w:id="87" w:name="_Toc221015712"/>
       <w:r>
         <w:t>Tabellen</w:t>
       </w:r>
@@ -16329,7 +16335,7 @@
       <w:pPr>
         <w:pStyle w:val="berschrift2"/>
       </w:pPr>
-      <w:bookmarkStart w:id="89" w:name="_Toc214970094"/>
+      <w:bookmarkStart w:id="89" w:name="_Toc221015713"/>
       <w:r>
         <w:t>Quellen</w:t>
       </w:r>
@@ -16518,7 +16524,6 @@
         <w:dataBinding w:prefixMappings="xmlns:ns0='http://purl.org/dc/elements/1.1/' xmlns:ns1='http://schemas.openxmlformats.org/package/2006/metadata/core-properties' " w:xpath="/ns1:coreProperties[1]/ns1:category[1]" w:storeItemID="{6C3C8BC8-F283-45AE-878A-BAB7291924A1}"/>
         <w:text/>
       </w:sdtPr>
-      <w:sdtEndPr/>
       <w:sdtContent>
         <w:r>
           <w:rPr>
@@ -16561,7 +16566,6 @@
         <w:dataBinding w:prefixMappings="xmlns:ns0='http://purl.org/dc/elements/1.1/' xmlns:ns1='http://schemas.openxmlformats.org/package/2006/metadata/core-properties' " w:xpath="/ns1:coreProperties[1]/ns0:title[1]" w:storeItemID="{6C3C8BC8-F283-45AE-878A-BAB7291924A1}"/>
         <w:text/>
       </w:sdtPr>
-      <w:sdtEndPr/>
       <w:sdtContent>
         <w:r>
           <w:rPr>
@@ -16603,7 +16607,6 @@
         <w:dataBinding w:prefixMappings="xmlns:ns0='http://purl.org/dc/elements/1.1/' xmlns:ns1='http://schemas.openxmlformats.org/package/2006/metadata/core-properties' " w:xpath="/ns1:coreProperties[1]/ns1:contentStatus[1]" w:storeItemID="{6C3C8BC8-F283-45AE-878A-BAB7291924A1}"/>
         <w:text/>
       </w:sdtPr>
-      <w:sdtEndPr/>
       <w:sdtContent>
         <w:r>
           <w:rPr>
@@ -21464,6 +21467,7 @@
     <w:rsid w:val="002D24B7"/>
     <w:rsid w:val="0030643A"/>
     <w:rsid w:val="00507F45"/>
+    <w:rsid w:val="00517639"/>
     <w:rsid w:val="005177BC"/>
     <w:rsid w:val="005D4A28"/>
     <w:rsid w:val="005E62CF"/>
@@ -21494,6 +21498,7 @@
     <w:rsid w:val="00D47988"/>
     <w:rsid w:val="00D632DB"/>
     <w:rsid w:val="00D730D8"/>
+    <w:rsid w:val="00D805C5"/>
     <w:rsid w:val="00DC66DA"/>
     <w:rsid w:val="00DE69D2"/>
     <w:rsid w:val="00E42863"/>
@@ -22183,10 +22188,6 @@
 </file>
 
 <file path=customXml/item1.xml><?xml version="1.0" encoding="utf-8"?>
-<b:Sources xmlns:b="http://schemas.openxmlformats.org/officeDocument/2006/bibliography" xmlns="http://schemas.openxmlformats.org/officeDocument/2006/bibliography" SelectedStyle="\APASixthEditionOfficeOnline.xsl" StyleName="APA" Version="6"/>
-</file>
-
-<file path=customXml/item2.xml><?xml version="1.0" encoding="utf-8"?>
 <ct:contentTypeSchema xmlns:ct="http://schemas.microsoft.com/office/2006/metadata/contentType" xmlns:ma="http://schemas.microsoft.com/office/2006/metadata/properties/metaAttributes" ct:_="" ma:_="" ma:contentTypeName="Dokument" ma:contentTypeID="0x010100A126817EE653F44FB580535BAFF71B76" ma:contentTypeVersion="13" ma:contentTypeDescription="Ein neues Dokument erstellen." ma:contentTypeScope="" ma:versionID="b7f64dff3cf3c9b1ec125c71c5c5b863">
   <xsd:schema xmlns:xsd="http://www.w3.org/2001/XMLSchema" xmlns:xs="http://www.w3.org/2001/XMLSchema" xmlns:p="http://schemas.microsoft.com/office/2006/metadata/properties" xmlns:ns2="46eb9099-7dd6-4793-9b95-bd76d8cd2ac6" xmlns:ns3="b443b60d-c1ec-4166-a4bb-f67dccbf8c3d" targetNamespace="http://schemas.microsoft.com/office/2006/metadata/properties" ma:root="true" ma:fieldsID="2480804df4774d270e3faabea5cfcca2" ns2:_="" ns3:_="">
     <xsd:import namespace="46eb9099-7dd6-4793-9b95-bd76d8cd2ac6"/>
@@ -22393,6 +22394,17 @@
 </ct:contentTypeSchema>
 </file>
 
+<file path=customXml/item2.xml><?xml version="1.0" encoding="utf-8"?>
+<p:properties xmlns:p="http://schemas.microsoft.com/office/2006/metadata/properties" xmlns:xsi="http://www.w3.org/2001/XMLSchema-instance" xmlns:pc="http://schemas.microsoft.com/office/infopath/2007/PartnerControls">
+  <documentManagement>
+    <lcf76f155ced4ddcb4097134ff3c332f xmlns="46eb9099-7dd6-4793-9b95-bd76d8cd2ac6">
+      <Terms xmlns="http://schemas.microsoft.com/office/infopath/2007/PartnerControls"/>
+    </lcf76f155ced4ddcb4097134ff3c332f>
+    <TaxCatchAll xmlns="b443b60d-c1ec-4166-a4bb-f67dccbf8c3d" xsi:nil="true"/>
+  </documentManagement>
+</p:properties>
+</file>
+
 <file path=customXml/item3.xml><?xml version="1.0" encoding="utf-8"?>
 <?mso-contentType ?>
 <FormTemplates xmlns="http://schemas.microsoft.com/sharepoint/v3/contenttype/forms">
@@ -22403,25 +22415,10 @@
 </file>
 
 <file path=customXml/item4.xml><?xml version="1.0" encoding="utf-8"?>
-<p:properties xmlns:p="http://schemas.microsoft.com/office/2006/metadata/properties" xmlns:xsi="http://www.w3.org/2001/XMLSchema-instance" xmlns:pc="http://schemas.microsoft.com/office/infopath/2007/PartnerControls">
-  <documentManagement>
-    <lcf76f155ced4ddcb4097134ff3c332f xmlns="46eb9099-7dd6-4793-9b95-bd76d8cd2ac6">
-      <Terms xmlns="http://schemas.microsoft.com/office/infopath/2007/PartnerControls"/>
-    </lcf76f155ced4ddcb4097134ff3c332f>
-    <TaxCatchAll xmlns="b443b60d-c1ec-4166-a4bb-f67dccbf8c3d" xsi:nil="true"/>
-  </documentManagement>
-</p:properties>
+<b:Sources xmlns:b="http://schemas.openxmlformats.org/officeDocument/2006/bibliography" xmlns="http://schemas.openxmlformats.org/officeDocument/2006/bibliography" SelectedStyle="\APASixthEditionOfficeOnline.xsl" StyleName="APA" Version="6"/>
 </file>
 
 <file path=customXml/itemProps1.xml><?xml version="1.0" encoding="utf-8"?>
-<ds:datastoreItem xmlns:ds="http://schemas.openxmlformats.org/officeDocument/2006/customXml" ds:itemID="{B6F5B63D-75CB-41E9-9D4E-E58226A134E5}">
-  <ds:schemaRefs>
-    <ds:schemaRef ds:uri="http://schemas.openxmlformats.org/officeDocument/2006/bibliography"/>
-  </ds:schemaRefs>
-</ds:datastoreItem>
-</file>
-
-<file path=customXml/itemProps2.xml><?xml version="1.0" encoding="utf-8"?>
 <ds:datastoreItem xmlns:ds="http://schemas.openxmlformats.org/officeDocument/2006/customXml" ds:itemID="{058073D4-FBF0-43EB-8D08-61D662B48D75}">
   <ds:schemaRefs>
     <ds:schemaRef ds:uri="http://schemas.microsoft.com/office/2006/metadata/contentType"/>
@@ -22440,15 +22437,7 @@
 </ds:datastoreItem>
 </file>
 
-<file path=customXml/itemProps3.xml><?xml version="1.0" encoding="utf-8"?>
-<ds:datastoreItem xmlns:ds="http://schemas.openxmlformats.org/officeDocument/2006/customXml" ds:itemID="{0494ADC6-6FDC-4384-9E53-3B9C03EA5998}">
-  <ds:schemaRefs>
-    <ds:schemaRef ds:uri="http://schemas.microsoft.com/sharepoint/v3/contenttype/forms"/>
-  </ds:schemaRefs>
-</ds:datastoreItem>
-</file>
-
-<file path=customXml/itemProps4.xml><?xml version="1.0" encoding="utf-8"?>
+<file path=customXml/itemProps2.xml><?xml version="1.0" encoding="utf-8"?>
 <ds:datastoreItem xmlns:ds="http://schemas.openxmlformats.org/officeDocument/2006/customXml" ds:itemID="{CBA37030-E913-4E37-A03C-881271D4064D}">
   <ds:schemaRefs>
     <ds:schemaRef ds:uri="http://schemas.microsoft.com/office/2006/metadata/properties"/>
@@ -22459,6 +22448,22 @@
 </ds:datastoreItem>
 </file>
 
+<file path=customXml/itemProps3.xml><?xml version="1.0" encoding="utf-8"?>
+<ds:datastoreItem xmlns:ds="http://schemas.openxmlformats.org/officeDocument/2006/customXml" ds:itemID="{0494ADC6-6FDC-4384-9E53-3B9C03EA5998}">
+  <ds:schemaRefs>
+    <ds:schemaRef ds:uri="http://schemas.microsoft.com/sharepoint/v3/contenttype/forms"/>
+  </ds:schemaRefs>
+</ds:datastoreItem>
+</file>
+
+<file path=customXml/itemProps4.xml><?xml version="1.0" encoding="utf-8"?>
+<ds:datastoreItem xmlns:ds="http://schemas.openxmlformats.org/officeDocument/2006/customXml" ds:itemID="{B6F5B63D-75CB-41E9-9D4E-E58226A134E5}">
+  <ds:schemaRefs>
+    <ds:schemaRef ds:uri="http://schemas.openxmlformats.org/officeDocument/2006/bibliography"/>
+  </ds:schemaRefs>
+</ds:datastoreItem>
+</file>
+
 <file path=docMetadata/LabelInfo.xml><?xml version="1.0" encoding="utf-8"?>
 <clbl:labelList xmlns:clbl="http://schemas.microsoft.com/office/2020/mipLabelMetadata">
   <clbl:label id="{5daf41bd-338c-4311-b1b0-e1299889c34b}" enabled="0" method="" siteId="{5daf41bd-338c-4311-b1b0-e1299889c34b}" removed="1"/>

</xml_diff>

<commit_message>
BugFix ArrowPosition getting stuck
</commit_message>
<xml_diff>
--- a/Word/SmartClock_Projekdokumentation.docx
+++ b/Word/SmartClock_Projekdokumentation.docx
@@ -525,10 +525,10 @@
                                     <pic:cNvPicPr/>
                                   </pic:nvPicPr>
                                   <pic:blipFill>
-                                    <a:blip r:embed="rId11">
+                                    <a:blip r:embed="rId13">
                                       <a:extLst>
                                         <a:ext uri="{96DAC541-7B7A-43D3-8B79-37D633B846F1}">
-                                          <asvg:svgBlip xmlns:asvg="http://schemas.microsoft.com/office/drawing/2016/SVG/main" r:embed="rId12"/>
+                                          <asvg:svgBlip xmlns:asvg="http://schemas.microsoft.com/office/drawing/2016/SVG/main" r:embed="rId14"/>
                                         </a:ext>
                                       </a:extLst>
                                     </a:blip>
@@ -741,7 +741,6 @@
         <w:dataBinding w:prefixMappings="xmlns:ns0='http://purl.org/dc/elements/1.1/' xmlns:ns1='http://schemas.openxmlformats.org/package/2006/metadata/core-properties' " w:xpath="/ns1:coreProperties[1]/ns0:subject[1]" w:storeItemID="{6C3C8BC8-F283-45AE-878A-BAB7291924A1}"/>
         <w:text/>
       </w:sdtPr>
-      <w:sdtEndPr/>
       <w:sdtContent>
         <w:p>
           <w:pPr>
@@ -781,7 +780,6 @@
         <w:dataBinding w:prefixMappings="xmlns:ns0='http://purl.org/dc/elements/1.1/' xmlns:ns1='http://schemas.openxmlformats.org/package/2006/metadata/core-properties' " w:xpath="/ns1:coreProperties[1]/ns0:title[1]" w:storeItemID="{6C3C8BC8-F283-45AE-878A-BAB7291924A1}"/>
         <w:text/>
       </w:sdtPr>
-      <w:sdtEndPr/>
       <w:sdtContent>
         <w:p>
           <w:pPr>
@@ -889,7 +887,6 @@
                               <w:dataBinding w:prefixMappings="xmlns:ns0='http://purl.org/dc/elements/1.1/' xmlns:ns1='http://schemas.openxmlformats.org/package/2006/metadata/core-properties' " w:xpath="/ns1:coreProperties[1]/ns0:creator[1]" w:storeItemID="{6C3C8BC8-F283-45AE-878A-BAB7291924A1}"/>
                               <w:text w:multiLine="1"/>
                             </w:sdtPr>
-                            <w:sdtEndPr/>
                             <w:sdtContent>
                               <w:p>
                                 <w:pPr>
@@ -957,7 +954,6 @@
                                 <w:dataBinding w:prefixMappings="xmlns:ns0='http://purl.org/dc/elements/1.1/' xmlns:ns1='http://schemas.openxmlformats.org/package/2006/metadata/core-properties' " w:xpath="/ns1:coreProperties[1]/ns1:contentStatus[1]" w:storeItemID="{6C3C8BC8-F283-45AE-878A-BAB7291924A1}"/>
                                 <w:text/>
                               </w:sdtPr>
-                              <w:sdtEndPr/>
                               <w:sdtContent>
                                 <w:r>
                                   <w:rPr>
@@ -1140,10 +1136,10 @@
                     <pic:cNvPicPr/>
                   </pic:nvPicPr>
                   <pic:blipFill>
-                    <a:blip r:embed="rId13">
+                    <a:blip r:embed="rId15">
                       <a:extLst>
                         <a:ext uri="{96DAC541-7B7A-43D3-8B79-37D633B846F1}">
-                          <asvg:svgBlip xmlns:asvg="http://schemas.microsoft.com/office/drawing/2016/SVG/main" r:embed="rId14"/>
+                          <asvg:svgBlip xmlns:asvg="http://schemas.microsoft.com/office/drawing/2016/SVG/main" r:embed="rId16"/>
                         </a:ext>
                       </a:extLst>
                     </a:blip>
@@ -3465,7 +3461,7 @@
                     </pic:cNvPicPr>
                   </pic:nvPicPr>
                   <pic:blipFill>
-                    <a:blip r:embed="rId15" cstate="print">
+                    <a:blip r:embed="rId17" cstate="print">
                       <a:extLst>
                         <a:ext uri="{28A0092B-C50C-407E-A947-70E740481C1C}">
                           <a14:useLocalDpi xmlns:a14="http://schemas.microsoft.com/office/drawing/2010/main" val="0"/>
@@ -3698,7 +3694,7 @@
                     </pic:cNvPicPr>
                   </pic:nvPicPr>
                   <pic:blipFill>
-                    <a:blip r:embed="rId16" cstate="print">
+                    <a:blip r:embed="rId18" cstate="print">
                       <a:extLst>
                         <a:ext uri="{28A0092B-C50C-407E-A947-70E740481C1C}">
                           <a14:useLocalDpi xmlns:a14="http://schemas.microsoft.com/office/drawing/2010/main" val="0"/>
@@ -3852,7 +3848,7 @@
                                 <w:szCs w:val="22"/>
                               </w:rPr>
                             </w:pPr>
-                            <w:bookmarkStart w:id="5" w:name="_Toc222209632"/>
+                            <w:bookmarkStart w:id="4" w:name="_Toc222209632"/>
                             <w:r>
                               <w:t xml:space="preserve">Abbildung </w:t>
                             </w:r>
@@ -3867,7 +3863,7 @@
                             <w:r>
                               <w:t xml:space="preserve"> - MicroMod ATP Carrier Board</w:t>
                             </w:r>
-                            <w:bookmarkEnd w:id="5"/>
+                            <w:bookmarkEnd w:id="4"/>
                           </w:p>
                         </w:txbxContent>
                       </wps:txbx>
@@ -3957,7 +3953,7 @@
                     </pic:cNvPicPr>
                   </pic:nvPicPr>
                   <pic:blipFill>
-                    <a:blip r:embed="rId17" cstate="print">
+                    <a:blip r:embed="rId19" cstate="print">
                       <a:extLst>
                         <a:ext uri="{28A0092B-C50C-407E-A947-70E740481C1C}">
                           <a14:useLocalDpi xmlns:a14="http://schemas.microsoft.com/office/drawing/2010/main" val="0"/>
@@ -4101,7 +4097,7 @@
                                 <w:szCs w:val="22"/>
                               </w:rPr>
                             </w:pPr>
-                            <w:bookmarkStart w:id="7" w:name="_Toc222209633"/>
+                            <w:bookmarkStart w:id="5" w:name="_Toc222209633"/>
                             <w:r>
                               <w:t xml:space="preserve">Abbildung </w:t>
                             </w:r>
@@ -4116,7 +4112,7 @@
                             <w:r>
                               <w:t xml:space="preserve"> - Environmental Combo Breakout</w:t>
                             </w:r>
-                            <w:bookmarkEnd w:id="7"/>
+                            <w:bookmarkEnd w:id="5"/>
                           </w:p>
                         </w:txbxContent>
                       </wps:txbx>
@@ -4234,7 +4230,7 @@
                                 <w:szCs w:val="22"/>
                               </w:rPr>
                             </w:pPr>
-                            <w:bookmarkStart w:id="9" w:name="_Toc222209634"/>
+                            <w:bookmarkStart w:id="6" w:name="_Toc222209634"/>
                             <w:r>
                               <w:t xml:space="preserve">Abbildung </w:t>
                             </w:r>
@@ -4249,7 +4245,7 @@
                             <w:r>
                               <w:t xml:space="preserve"> - SerLCD</w:t>
                             </w:r>
-                            <w:bookmarkEnd w:id="9"/>
+                            <w:bookmarkEnd w:id="6"/>
                           </w:p>
                         </w:txbxContent>
                       </wps:txbx>
@@ -4334,7 +4330,7 @@
                     </pic:cNvPicPr>
                   </pic:nvPicPr>
                   <pic:blipFill>
-                    <a:blip r:embed="rId18" cstate="print">
+                    <a:blip r:embed="rId20" cstate="print">
                       <a:extLst>
                         <a:ext uri="{28A0092B-C50C-407E-A947-70E740481C1C}">
                           <a14:useLocalDpi xmlns:a14="http://schemas.microsoft.com/office/drawing/2010/main" val="0"/>
@@ -4496,7 +4492,7 @@
                                 <w:szCs w:val="22"/>
                               </w:rPr>
                             </w:pPr>
-                            <w:bookmarkStart w:id="11" w:name="_Toc222209635"/>
+                            <w:bookmarkStart w:id="7" w:name="_Toc222209635"/>
                             <w:r>
                               <w:t xml:space="preserve">Abbildung </w:t>
                             </w:r>
@@ -4511,7 +4507,7 @@
                             <w:r>
                               <w:t xml:space="preserve"> - Qwiic Button</w:t>
                             </w:r>
-                            <w:bookmarkEnd w:id="11"/>
+                            <w:bookmarkEnd w:id="7"/>
                           </w:p>
                         </w:txbxContent>
                       </wps:txbx>
@@ -4596,7 +4592,7 @@
                     </pic:cNvPicPr>
                   </pic:nvPicPr>
                   <pic:blipFill>
-                    <a:blip r:embed="rId19" cstate="print">
+                    <a:blip r:embed="rId21" cstate="print">
                       <a:extLst>
                         <a:ext uri="{28A0092B-C50C-407E-A947-70E740481C1C}">
                           <a14:useLocalDpi xmlns:a14="http://schemas.microsoft.com/office/drawing/2010/main" val="0"/>
@@ -4744,7 +4740,7 @@
                                 <w:szCs w:val="22"/>
                               </w:rPr>
                             </w:pPr>
-                            <w:bookmarkStart w:id="13" w:name="_Toc222209636"/>
+                            <w:bookmarkStart w:id="8" w:name="_Toc222209636"/>
                             <w:r>
                               <w:t xml:space="preserve">Abbildung </w:t>
                             </w:r>
@@ -4759,7 +4755,7 @@
                             <w:r>
                               <w:t xml:space="preserve"> - Sparkfun Buzzer</w:t>
                             </w:r>
-                            <w:bookmarkEnd w:id="13"/>
+                            <w:bookmarkEnd w:id="8"/>
                           </w:p>
                         </w:txbxContent>
                       </wps:txbx>
@@ -4842,7 +4838,7 @@
                     </pic:cNvPicPr>
                   </pic:nvPicPr>
                   <pic:blipFill>
-                    <a:blip r:embed="rId20" cstate="print">
+                    <a:blip r:embed="rId22" cstate="print">
                       <a:extLst>
                         <a:ext uri="{28A0092B-C50C-407E-A947-70E740481C1C}">
                           <a14:useLocalDpi xmlns:a14="http://schemas.microsoft.com/office/drawing/2010/main" val="0"/>
@@ -5008,7 +5004,7 @@
                                 <w:szCs w:val="22"/>
                               </w:rPr>
                             </w:pPr>
-                            <w:bookmarkStart w:id="15" w:name="_Toc222209637"/>
+                            <w:bookmarkStart w:id="9" w:name="_Toc222209637"/>
                             <w:r>
                               <w:t xml:space="preserve">Abbildung </w:t>
                             </w:r>
@@ -5023,7 +5019,7 @@
                             <w:r>
                               <w:t xml:space="preserve"> - Qwiic Cable</w:t>
                             </w:r>
-                            <w:bookmarkEnd w:id="15"/>
+                            <w:bookmarkEnd w:id="9"/>
                           </w:p>
                         </w:txbxContent>
                       </wps:txbx>
@@ -5108,7 +5104,7 @@
                     </pic:cNvPicPr>
                   </pic:nvPicPr>
                   <pic:blipFill>
-                    <a:blip r:embed="rId21" cstate="print">
+                    <a:blip r:embed="rId23" cstate="print">
                       <a:extLst>
                         <a:ext uri="{28A0092B-C50C-407E-A947-70E740481C1C}">
                           <a14:useLocalDpi xmlns:a14="http://schemas.microsoft.com/office/drawing/2010/main" val="0"/>
@@ -5282,7 +5278,7 @@
                                 <w:szCs w:val="22"/>
                               </w:rPr>
                             </w:pPr>
-                            <w:bookmarkStart w:id="17" w:name="_Toc222209638"/>
+                            <w:bookmarkStart w:id="10" w:name="_Toc222209638"/>
                             <w:r>
                               <w:t xml:space="preserve">Abbildung </w:t>
                             </w:r>
@@ -5297,7 +5293,7 @@
                             <w:r>
                               <w:t xml:space="preserve"> - Multiport</w:t>
                             </w:r>
-                            <w:bookmarkEnd w:id="17"/>
+                            <w:bookmarkEnd w:id="10"/>
                           </w:p>
                         </w:txbxContent>
                       </wps:txbx>
@@ -5382,7 +5378,7 @@
                     </pic:cNvPicPr>
                   </pic:nvPicPr>
                   <pic:blipFill>
-                    <a:blip r:embed="rId22" cstate="print">
+                    <a:blip r:embed="rId24" cstate="print">
                       <a:extLst>
                         <a:ext uri="{28A0092B-C50C-407E-A947-70E740481C1C}">
                           <a14:useLocalDpi xmlns:a14="http://schemas.microsoft.com/office/drawing/2010/main" val="0"/>
@@ -5552,7 +5548,7 @@
                                 <w:szCs w:val="22"/>
                               </w:rPr>
                             </w:pPr>
-                            <w:bookmarkStart w:id="19" w:name="_Toc222209639"/>
+                            <w:bookmarkStart w:id="11" w:name="_Toc222209639"/>
                             <w:r>
                               <w:t xml:space="preserve">Abbildung </w:t>
                             </w:r>
@@ -5567,7 +5563,7 @@
                             <w:r>
                               <w:t xml:space="preserve"> - Thumb Slide Joystick</w:t>
                             </w:r>
-                            <w:bookmarkEnd w:id="19"/>
+                            <w:bookmarkEnd w:id="11"/>
                           </w:p>
                         </w:txbxContent>
                       </wps:txbx>
@@ -5657,7 +5653,7 @@
                     </pic:cNvPicPr>
                   </pic:nvPicPr>
                   <pic:blipFill>
-                    <a:blip r:embed="rId23" cstate="print">
+                    <a:blip r:embed="rId25" cstate="print">
                       <a:extLst>
                         <a:ext uri="{28A0092B-C50C-407E-A947-70E740481C1C}">
                           <a14:useLocalDpi xmlns:a14="http://schemas.microsoft.com/office/drawing/2010/main" val="0"/>
@@ -5722,7 +5718,7 @@
                     </pic:cNvPicPr>
                   </pic:nvPicPr>
                   <pic:blipFill>
-                    <a:blip r:embed="rId24" cstate="print">
+                    <a:blip r:embed="rId26" cstate="print">
                       <a:extLst>
                         <a:ext uri="{28A0092B-C50C-407E-A947-70E740481C1C}">
                           <a14:useLocalDpi xmlns:a14="http://schemas.microsoft.com/office/drawing/2010/main" val="0"/>
@@ -5858,7 +5854,7 @@
                                 <w:szCs w:val="22"/>
                               </w:rPr>
                             </w:pPr>
-                            <w:bookmarkStart w:id="21" w:name="_Toc222209640"/>
+                            <w:bookmarkStart w:id="12" w:name="_Toc222209640"/>
                             <w:r>
                               <w:t xml:space="preserve">Abbildung </w:t>
                             </w:r>
@@ -5873,7 +5869,7 @@
                             <w:r>
                               <w:t xml:space="preserve"> - USB-a zu USB-c</w:t>
                             </w:r>
-                            <w:bookmarkEnd w:id="21"/>
+                            <w:bookmarkEnd w:id="12"/>
                           </w:p>
                         </w:txbxContent>
                       </wps:txbx>
@@ -5940,11 +5936,11 @@
       <w:pPr>
         <w:pStyle w:val="berschrift3"/>
       </w:pPr>
-      <w:bookmarkStart w:id="23" w:name="_Toc222209610"/>
+      <w:bookmarkStart w:id="13" w:name="_Toc222209610"/>
       <w:r>
         <w:t>Ab wann ist die Luftqualität schlecht?</w:t>
       </w:r>
-      <w:bookmarkEnd w:id="23"/>
+      <w:bookmarkEnd w:id="13"/>
     </w:p>
     <w:p>
       <w:r>
@@ -6144,12 +6140,12 @@
       <w:pPr>
         <w:pStyle w:val="berschrift2"/>
       </w:pPr>
-      <w:bookmarkStart w:id="24" w:name="_Toc222209611"/>
+      <w:bookmarkStart w:id="14" w:name="_Toc222209611"/>
       <w:r>
         <w:lastRenderedPageBreak/>
         <w:t>Planen</w:t>
       </w:r>
-      <w:bookmarkEnd w:id="24"/>
+      <w:bookmarkEnd w:id="14"/>
       <w:r>
         <w:tab/>
       </w:r>
@@ -6158,11 +6154,11 @@
       <w:pPr>
         <w:pStyle w:val="berschrift3"/>
       </w:pPr>
-      <w:bookmarkStart w:id="25" w:name="_Toc222209612"/>
+      <w:bookmarkStart w:id="15" w:name="_Toc222209612"/>
       <w:r>
         <w:t>Verkabelungen</w:t>
       </w:r>
-      <w:bookmarkEnd w:id="25"/>
+      <w:bookmarkEnd w:id="15"/>
     </w:p>
     <w:p>
       <w:pPr>
@@ -6181,7 +6177,7 @@
           <w:noProof/>
         </w:rPr>
         <w:drawing>
-          <wp:anchor distT="0" distB="0" distL="114300" distR="114300" simplePos="0" relativeHeight="251769856" behindDoc="0" locked="0" layoutInCell="1" allowOverlap="1" wp14:anchorId="5DA10DA6" wp14:editId="2AFDBD15">
+          <wp:anchor distT="0" distB="0" distL="114300" distR="114300" simplePos="0" relativeHeight="251769856" behindDoc="0" locked="0" layoutInCell="1" allowOverlap="1" wp14:anchorId="5DA10DA6" wp14:editId="22A422BE">
             <wp:simplePos x="0" y="0"/>
             <wp:positionH relativeFrom="margin">
               <wp:posOffset>-85090</wp:posOffset>
@@ -6204,7 +6200,7 @@
                     <pic:cNvPicPr/>
                   </pic:nvPicPr>
                   <pic:blipFill>
-                    <a:blip r:embed="rId25" cstate="print">
+                    <a:blip r:embed="rId27" cstate="print">
                       <a:extLst>
                         <a:ext uri="{28A0092B-C50C-407E-A947-70E740481C1C}">
                           <a14:useLocalDpi xmlns:a14="http://schemas.microsoft.com/office/drawing/2010/main" val="0"/>
@@ -6310,7 +6306,7 @@
                                 <w:szCs w:val="22"/>
                               </w:rPr>
                             </w:pPr>
-                            <w:bookmarkStart w:id="26" w:name="_Toc222209641"/>
+                            <w:bookmarkStart w:id="16" w:name="_Toc222209641"/>
                             <w:r>
                               <w:t xml:space="preserve">Abbildung </w:t>
                             </w:r>
@@ -6325,7 +6321,7 @@
                             <w:r>
                               <w:t xml:space="preserve"> - Verkabelung V1</w:t>
                             </w:r>
-                            <w:bookmarkEnd w:id="26"/>
+                            <w:bookmarkEnd w:id="16"/>
                           </w:p>
                         </w:txbxContent>
                       </wps:txbx>
@@ -6433,7 +6429,7 @@
                                 <w:szCs w:val="22"/>
                               </w:rPr>
                             </w:pPr>
-                            <w:bookmarkStart w:id="28" w:name="_Toc222209642"/>
+                            <w:bookmarkStart w:id="17" w:name="_Toc222209642"/>
                             <w:r>
                               <w:t xml:space="preserve">Abbildung </w:t>
                             </w:r>
@@ -6448,7 +6444,7 @@
                             <w:r>
                               <w:t xml:space="preserve"> - Verkabelung V2</w:t>
                             </w:r>
-                            <w:bookmarkEnd w:id="28"/>
+                            <w:bookmarkEnd w:id="17"/>
                           </w:p>
                         </w:txbxContent>
                       </wps:txbx>
@@ -6534,7 +6530,7 @@
                     <pic:cNvPicPr/>
                   </pic:nvPicPr>
                   <pic:blipFill rotWithShape="1">
-                    <a:blip r:embed="rId26">
+                    <a:blip r:embed="rId28">
                       <a:extLst>
                         <a:ext uri="{28A0092B-C50C-407E-A947-70E740481C1C}">
                           <a14:useLocalDpi xmlns:a14="http://schemas.microsoft.com/office/drawing/2010/main" val="0"/>
@@ -6684,7 +6680,7 @@
           <w:lang w:eastAsia="de-CH"/>
         </w:rPr>
       </w:pPr>
-      <w:bookmarkStart w:id="30" w:name="_Toc222209613"/>
+      <w:bookmarkStart w:id="18" w:name="_Toc222209613"/>
       <w:r>
         <w:rPr>
           <w:lang w:eastAsia="de-CH"/>
@@ -6698,7 +6694,7 @@
         </w:rPr>
         <w:t>ung</w:t>
       </w:r>
-      <w:bookmarkEnd w:id="30"/>
+      <w:bookmarkEnd w:id="18"/>
     </w:p>
     <w:p>
       <w:pPr>
@@ -6778,7 +6774,7 @@
                                 <w:szCs w:val="22"/>
                               </w:rPr>
                             </w:pPr>
-                            <w:bookmarkStart w:id="31" w:name="_Toc222209643"/>
+                            <w:bookmarkStart w:id="19" w:name="_Toc222209643"/>
                             <w:r>
                               <w:t xml:space="preserve">Abbildung </w:t>
                             </w:r>
@@ -6793,7 +6789,7 @@
                             <w:r>
                               <w:t xml:space="preserve"> - WarnBuzz V1</w:t>
                             </w:r>
-                            <w:bookmarkEnd w:id="31"/>
+                            <w:bookmarkEnd w:id="19"/>
                           </w:p>
                         </w:txbxContent>
                       </wps:txbx>
@@ -6854,7 +6850,7 @@
           <w:lang w:eastAsia="de-CH"/>
         </w:rPr>
         <w:drawing>
-          <wp:anchor distT="0" distB="0" distL="114300" distR="114300" simplePos="0" relativeHeight="251811840" behindDoc="1" locked="0" layoutInCell="1" allowOverlap="1" wp14:anchorId="6E8AB879" wp14:editId="6E721E35">
+          <wp:anchor distT="0" distB="0" distL="114300" distR="114300" simplePos="0" relativeHeight="251811840" behindDoc="1" locked="0" layoutInCell="1" allowOverlap="1" wp14:anchorId="6E8AB879" wp14:editId="7337116B">
             <wp:simplePos x="0" y="0"/>
             <wp:positionH relativeFrom="margin">
               <wp:posOffset>-299720</wp:posOffset>
@@ -6879,7 +6875,7 @@
                     </pic:cNvPicPr>
                   </pic:nvPicPr>
                   <pic:blipFill rotWithShape="1">
-                    <a:blip r:embed="rId27" cstate="print">
+                    <a:blip r:embed="rId29" cstate="print">
                       <a:extLst>
                         <a:ext uri="{28A0092B-C50C-407E-A947-70E740481C1C}">
                           <a14:useLocalDpi xmlns:a14="http://schemas.microsoft.com/office/drawing/2010/main" val="0"/>
@@ -7362,7 +7358,7 @@
                                 <w:szCs w:val="22"/>
                               </w:rPr>
                             </w:pPr>
-                            <w:bookmarkStart w:id="33" w:name="_Toc222209644"/>
+                            <w:bookmarkStart w:id="20" w:name="_Toc222209644"/>
                             <w:r>
                               <w:t xml:space="preserve">Abbildung </w:t>
                             </w:r>
@@ -7377,7 +7373,7 @@
                             <w:r>
                               <w:t xml:space="preserve"> - WarnBuzz V2</w:t>
                             </w:r>
-                            <w:bookmarkEnd w:id="33"/>
+                            <w:bookmarkEnd w:id="20"/>
                           </w:p>
                         </w:txbxContent>
                       </wps:txbx>
@@ -7463,7 +7459,7 @@
                     </pic:cNvPicPr>
                   </pic:nvPicPr>
                   <pic:blipFill>
-                    <a:blip r:embed="rId28" cstate="print">
+                    <a:blip r:embed="rId30" cstate="print">
                       <a:extLst>
                         <a:ext uri="{28A0092B-C50C-407E-A947-70E740481C1C}">
                           <a14:useLocalDpi xmlns:a14="http://schemas.microsoft.com/office/drawing/2010/main" val="0"/>
@@ -7552,7 +7548,7 @@
                                 <w:szCs w:val="22"/>
                               </w:rPr>
                             </w:pPr>
-                            <w:bookmarkStart w:id="35" w:name="_Toc222209645"/>
+                            <w:bookmarkStart w:id="21" w:name="_Toc222209645"/>
                             <w:r>
                               <w:t xml:space="preserve">Abbildung </w:t>
                             </w:r>
@@ -7567,7 +7563,7 @@
                             <w:r>
                               <w:t xml:space="preserve"> - WarnBuzz V3</w:t>
                             </w:r>
-                            <w:bookmarkEnd w:id="35"/>
+                            <w:bookmarkEnd w:id="21"/>
                           </w:p>
                         </w:txbxContent>
                       </wps:txbx>
@@ -7628,7 +7624,7 @@
           <w:lang w:eastAsia="de-CH"/>
         </w:rPr>
         <w:drawing>
-          <wp:anchor distT="0" distB="0" distL="114300" distR="114300" simplePos="0" relativeHeight="251820032" behindDoc="1" locked="0" layoutInCell="1" allowOverlap="1" wp14:anchorId="382A7A6C" wp14:editId="794BDD34">
+          <wp:anchor distT="0" distB="0" distL="114300" distR="114300" simplePos="0" relativeHeight="251820032" behindDoc="1" locked="0" layoutInCell="1" allowOverlap="1" wp14:anchorId="382A7A6C" wp14:editId="03EE9782">
             <wp:simplePos x="0" y="0"/>
             <wp:positionH relativeFrom="margin">
               <wp:posOffset>-337185</wp:posOffset>
@@ -7653,7 +7649,7 @@
                     </pic:cNvPicPr>
                   </pic:nvPicPr>
                   <pic:blipFill>
-                    <a:blip r:embed="rId29" cstate="print">
+                    <a:blip r:embed="rId31" cstate="print">
                       <a:extLst>
                         <a:ext uri="{28A0092B-C50C-407E-A947-70E740481C1C}">
                           <a14:useLocalDpi xmlns:a14="http://schemas.microsoft.com/office/drawing/2010/main" val="0"/>
@@ -8027,7 +8023,7 @@
                                 <w:szCs w:val="22"/>
                               </w:rPr>
                             </w:pPr>
-                            <w:bookmarkStart w:id="37" w:name="_Toc222209646"/>
+                            <w:bookmarkStart w:id="22" w:name="_Toc222209646"/>
                             <w:r>
                               <w:t xml:space="preserve">Abbildung </w:t>
                             </w:r>
@@ -8042,7 +8038,7 @@
                             <w:r>
                               <w:t xml:space="preserve"> - SetTimer V1</w:t>
                             </w:r>
-                            <w:bookmarkEnd w:id="37"/>
+                            <w:bookmarkEnd w:id="22"/>
                           </w:p>
                         </w:txbxContent>
                       </wps:txbx>
@@ -8103,7 +8099,7 @@
           <w:lang w:eastAsia="de-CH"/>
         </w:rPr>
         <w:drawing>
-          <wp:anchor distT="0" distB="0" distL="114300" distR="114300" simplePos="0" relativeHeight="251802624" behindDoc="0" locked="0" layoutInCell="1" allowOverlap="1" wp14:anchorId="26C37EF2" wp14:editId="0BCE02BE">
+          <wp:anchor distT="0" distB="0" distL="114300" distR="114300" simplePos="0" relativeHeight="251802624" behindDoc="0" locked="0" layoutInCell="1" allowOverlap="1" wp14:anchorId="26C37EF2" wp14:editId="2FEBCB9A">
             <wp:simplePos x="0" y="0"/>
             <wp:positionH relativeFrom="margin">
               <wp:posOffset>-457200</wp:posOffset>
@@ -8128,7 +8124,7 @@
                     </pic:cNvPicPr>
                   </pic:nvPicPr>
                   <pic:blipFill>
-                    <a:blip r:embed="rId30" cstate="print">
+                    <a:blip r:embed="rId32" cstate="print">
                       <a:extLst>
                         <a:ext uri="{28A0092B-C50C-407E-A947-70E740481C1C}">
                           <a14:useLocalDpi xmlns:a14="http://schemas.microsoft.com/office/drawing/2010/main" val="0"/>
@@ -8497,7 +8493,7 @@
                                 <w:szCs w:val="22"/>
                               </w:rPr>
                             </w:pPr>
-                            <w:bookmarkStart w:id="39" w:name="_Toc222209647"/>
+                            <w:bookmarkStart w:id="23" w:name="_Toc222209647"/>
                             <w:r>
                               <w:t xml:space="preserve">Abbildung </w:t>
                             </w:r>
@@ -8512,7 +8508,7 @@
                             <w:r>
                               <w:t xml:space="preserve"> - SetTimer V2</w:t>
                             </w:r>
-                            <w:bookmarkEnd w:id="39"/>
+                            <w:bookmarkEnd w:id="23"/>
                           </w:p>
                         </w:txbxContent>
                       </wps:txbx>
@@ -8573,7 +8569,7 @@
           <w:lang w:eastAsia="de-CH"/>
         </w:rPr>
         <w:drawing>
-          <wp:anchor distT="0" distB="0" distL="114300" distR="114300" simplePos="0" relativeHeight="251803648" behindDoc="0" locked="0" layoutInCell="1" allowOverlap="1" wp14:anchorId="713BF067" wp14:editId="7AB1A32E">
+          <wp:anchor distT="0" distB="0" distL="114300" distR="114300" simplePos="0" relativeHeight="251803648" behindDoc="0" locked="0" layoutInCell="1" allowOverlap="1" wp14:anchorId="713BF067" wp14:editId="748F137E">
             <wp:simplePos x="0" y="0"/>
             <wp:positionH relativeFrom="margin">
               <wp:posOffset>-507431</wp:posOffset>
@@ -8598,7 +8594,7 @@
                     </pic:cNvPicPr>
                   </pic:nvPicPr>
                   <pic:blipFill rotWithShape="1">
-                    <a:blip r:embed="rId31" cstate="print">
+                    <a:blip r:embed="rId33" cstate="print">
                       <a:extLst>
                         <a:ext uri="{28A0092B-C50C-407E-A947-70E740481C1C}">
                           <a14:useLocalDpi xmlns:a14="http://schemas.microsoft.com/office/drawing/2010/main" val="0"/>
@@ -8725,7 +8721,7 @@
                                 <w:szCs w:val="22"/>
                               </w:rPr>
                             </w:pPr>
-                            <w:bookmarkStart w:id="41" w:name="_Toc222209648"/>
+                            <w:bookmarkStart w:id="24" w:name="_Toc222209648"/>
                             <w:r>
                               <w:t xml:space="preserve">Abbildung </w:t>
                             </w:r>
@@ -8740,7 +8736,7 @@
                             <w:r>
                               <w:t xml:space="preserve"> - SetTimer V3</w:t>
                             </w:r>
-                            <w:bookmarkEnd w:id="41"/>
+                            <w:bookmarkEnd w:id="24"/>
                           </w:p>
                         </w:txbxContent>
                       </wps:txbx>
@@ -8826,7 +8822,7 @@
                     </pic:cNvPicPr>
                   </pic:nvPicPr>
                   <pic:blipFill rotWithShape="1">
-                    <a:blip r:embed="rId32" cstate="print">
+                    <a:blip r:embed="rId34" cstate="print">
                       <a:extLst>
                         <a:ext uri="{28A0092B-C50C-407E-A947-70E740481C1C}">
                           <a14:useLocalDpi xmlns:a14="http://schemas.microsoft.com/office/drawing/2010/main" val="0"/>
@@ -9335,7 +9331,7 @@
           <w:lang w:eastAsia="de-CH"/>
         </w:rPr>
       </w:pPr>
-      <w:bookmarkStart w:id="43" w:name="_Toc222209614"/>
+      <w:bookmarkStart w:id="25" w:name="_Toc222209614"/>
       <w:r>
         <w:rPr>
           <w:lang w:eastAsia="de-CH"/>
@@ -9343,7 +9339,7 @@
         <w:lastRenderedPageBreak/>
         <w:t>Menüs</w:t>
       </w:r>
-      <w:bookmarkEnd w:id="43"/>
+      <w:bookmarkEnd w:id="25"/>
     </w:p>
     <w:p>
       <w:pPr>
@@ -9423,7 +9419,7 @@
                                 <w:szCs w:val="22"/>
                               </w:rPr>
                             </w:pPr>
-                            <w:bookmarkStart w:id="44" w:name="_Toc222209649"/>
+                            <w:bookmarkStart w:id="26" w:name="_Toc222209649"/>
                             <w:r>
                               <w:t xml:space="preserve">Abbildung </w:t>
                             </w:r>
@@ -9438,7 +9434,7 @@
                             <w:r>
                               <w:t xml:space="preserve"> - Luftqualität</w:t>
                             </w:r>
-                            <w:bookmarkEnd w:id="44"/>
+                            <w:bookmarkEnd w:id="26"/>
                           </w:p>
                         </w:txbxContent>
                       </wps:txbx>
@@ -9522,7 +9518,7 @@
                     <pic:cNvPicPr/>
                   </pic:nvPicPr>
                   <pic:blipFill>
-                    <a:blip r:embed="rId33">
+                    <a:blip r:embed="rId35">
                       <a:extLst>
                         <a:ext uri="{28A0092B-C50C-407E-A947-70E740481C1C}">
                           <a14:useLocalDpi xmlns:a14="http://schemas.microsoft.com/office/drawing/2010/main" val="0"/>
@@ -9728,7 +9724,7 @@
                                 <w:szCs w:val="22"/>
                               </w:rPr>
                             </w:pPr>
-                            <w:bookmarkStart w:id="46" w:name="_Toc222209650"/>
+                            <w:bookmarkStart w:id="27" w:name="_Toc222209650"/>
                             <w:r>
                               <w:t xml:space="preserve">Abbildung </w:t>
                             </w:r>
@@ -9743,7 +9739,7 @@
                             <w:r>
                               <w:t xml:space="preserve"> - Datum &amp; Uhrzeit</w:t>
                             </w:r>
-                            <w:bookmarkEnd w:id="46"/>
+                            <w:bookmarkEnd w:id="27"/>
                           </w:p>
                         </w:txbxContent>
                       </wps:txbx>
@@ -9827,7 +9823,7 @@
                     <pic:cNvPicPr/>
                   </pic:nvPicPr>
                   <pic:blipFill>
-                    <a:blip r:embed="rId34">
+                    <a:blip r:embed="rId36">
                       <a:extLst>
                         <a:ext uri="{28A0092B-C50C-407E-A947-70E740481C1C}">
                           <a14:useLocalDpi xmlns:a14="http://schemas.microsoft.com/office/drawing/2010/main" val="0"/>
@@ -10027,7 +10023,7 @@
                                 <w:szCs w:val="22"/>
                               </w:rPr>
                             </w:pPr>
-                            <w:bookmarkStart w:id="48" w:name="_Toc222209651"/>
+                            <w:bookmarkStart w:id="28" w:name="_Toc222209651"/>
                             <w:r>
                               <w:t xml:space="preserve">Abbildung </w:t>
                             </w:r>
@@ -10042,7 +10038,7 @@
                             <w:r>
                               <w:t xml:space="preserve"> - Timer</w:t>
                             </w:r>
-                            <w:bookmarkEnd w:id="48"/>
+                            <w:bookmarkEnd w:id="28"/>
                           </w:p>
                         </w:txbxContent>
                       </wps:txbx>
@@ -10126,7 +10122,7 @@
                     <pic:cNvPicPr/>
                   </pic:nvPicPr>
                   <pic:blipFill>
-                    <a:blip r:embed="rId35">
+                    <a:blip r:embed="rId37">
                       <a:extLst>
                         <a:ext uri="{28A0092B-C50C-407E-A947-70E740481C1C}">
                           <a14:useLocalDpi xmlns:a14="http://schemas.microsoft.com/office/drawing/2010/main" val="0"/>
@@ -10283,7 +10279,7 @@
           <w:lang w:eastAsia="de-CH"/>
         </w:rPr>
       </w:pPr>
-      <w:bookmarkStart w:id="50" w:name="_Toc222209615"/>
+      <w:bookmarkStart w:id="29" w:name="_Toc222209615"/>
       <w:r>
         <w:rPr>
           <w:lang w:eastAsia="de-CH"/>
@@ -10291,7 +10287,7 @@
         <w:lastRenderedPageBreak/>
         <w:t>Entscheiden</w:t>
       </w:r>
-      <w:bookmarkEnd w:id="50"/>
+      <w:bookmarkEnd w:id="29"/>
     </w:p>
     <w:p>
       <w:pPr>
@@ -10300,14 +10296,14 @@
           <w:lang w:eastAsia="de-CH"/>
         </w:rPr>
       </w:pPr>
-      <w:bookmarkStart w:id="51" w:name="_Toc222209616"/>
+      <w:bookmarkStart w:id="30" w:name="_Toc222209616"/>
       <w:r>
         <w:rPr>
           <w:lang w:eastAsia="de-CH"/>
         </w:rPr>
         <w:t>Stückliste</w:t>
       </w:r>
-      <w:bookmarkEnd w:id="51"/>
+      <w:bookmarkEnd w:id="30"/>
     </w:p>
     <w:p>
       <w:pPr>
@@ -10365,7 +10361,7 @@
                                 <w:szCs w:val="22"/>
                               </w:rPr>
                             </w:pPr>
-                            <w:bookmarkStart w:id="52" w:name="_Toc222209652"/>
+                            <w:bookmarkStart w:id="31" w:name="_Toc222209652"/>
                             <w:r>
                               <w:t xml:space="preserve">Abbildung </w:t>
                             </w:r>
@@ -10380,7 +10376,7 @@
                             <w:r>
                               <w:t xml:space="preserve"> - Stückliste V1</w:t>
                             </w:r>
-                            <w:bookmarkEnd w:id="52"/>
+                            <w:bookmarkEnd w:id="31"/>
                           </w:p>
                         </w:txbxContent>
                       </wps:txbx>
@@ -10441,7 +10437,7 @@
           <w:lang w:eastAsia="de-CH"/>
         </w:rPr>
         <w:drawing>
-          <wp:anchor distT="0" distB="0" distL="114300" distR="114300" simplePos="0" relativeHeight="251798528" behindDoc="0" locked="0" layoutInCell="1" allowOverlap="1" wp14:anchorId="1031F8AC" wp14:editId="1AAD0551">
+          <wp:anchor distT="0" distB="0" distL="114300" distR="114300" simplePos="0" relativeHeight="251798528" behindDoc="0" locked="0" layoutInCell="1" allowOverlap="1" wp14:anchorId="1031F8AC" wp14:editId="01A6BC36">
             <wp:simplePos x="0" y="0"/>
             <wp:positionH relativeFrom="margin">
               <wp:align>left</wp:align>
@@ -10464,7 +10460,7 @@
                     <pic:cNvPicPr/>
                   </pic:nvPicPr>
                   <pic:blipFill>
-                    <a:blip r:embed="rId36" cstate="print">
+                    <a:blip r:embed="rId38" cstate="print">
                       <a:extLst>
                         <a:ext uri="{28A0092B-C50C-407E-A947-70E740481C1C}">
                           <a14:useLocalDpi xmlns:a14="http://schemas.microsoft.com/office/drawing/2010/main" val="0"/>
@@ -10576,7 +10572,7 @@
                                 <w:szCs w:val="22"/>
                               </w:rPr>
                             </w:pPr>
-                            <w:bookmarkStart w:id="54" w:name="_Toc222209653"/>
+                            <w:bookmarkStart w:id="32" w:name="_Toc222209653"/>
                             <w:r>
                               <w:t xml:space="preserve">Abbildung </w:t>
                             </w:r>
@@ -10591,7 +10587,7 @@
                             <w:r>
                               <w:t xml:space="preserve"> - Stückliste V2</w:t>
                             </w:r>
-                            <w:bookmarkEnd w:id="54"/>
+                            <w:bookmarkEnd w:id="32"/>
                           </w:p>
                         </w:txbxContent>
                       </wps:txbx>
@@ -10675,7 +10671,7 @@
                     <pic:cNvPicPr/>
                   </pic:nvPicPr>
                   <pic:blipFill rotWithShape="1">
-                    <a:blip r:embed="rId37">
+                    <a:blip r:embed="rId39">
                       <a:extLst>
                         <a:ext uri="{28A0092B-C50C-407E-A947-70E740481C1C}">
                           <a14:useLocalDpi xmlns:a14="http://schemas.microsoft.com/office/drawing/2010/main" val="0"/>
@@ -10737,7 +10733,7 @@
           <w:lang w:eastAsia="de-CH"/>
         </w:rPr>
       </w:pPr>
-      <w:bookmarkStart w:id="56" w:name="_Toc222209617"/>
+      <w:bookmarkStart w:id="33" w:name="_Toc222209617"/>
       <w:r>
         <w:rPr>
           <w:lang w:eastAsia="de-CH"/>
@@ -10745,7 +10741,7 @@
         <w:lastRenderedPageBreak/>
         <w:t>Realisieren</w:t>
       </w:r>
-      <w:bookmarkEnd w:id="56"/>
+      <w:bookmarkEnd w:id="33"/>
     </w:p>
     <w:p>
       <w:pPr>
@@ -10754,14 +10750,14 @@
           <w:lang w:eastAsia="de-CH"/>
         </w:rPr>
       </w:pPr>
-      <w:bookmarkStart w:id="57" w:name="_Toc222209618"/>
+      <w:bookmarkStart w:id="34" w:name="_Toc222209618"/>
       <w:r>
         <w:rPr>
           <w:lang w:eastAsia="de-CH"/>
         </w:rPr>
         <w:t>Zusammenbau</w:t>
       </w:r>
-      <w:bookmarkEnd w:id="57"/>
+      <w:bookmarkEnd w:id="34"/>
     </w:p>
     <w:p>
       <w:pPr>
@@ -10860,7 +10856,7 @@
                                 <w:szCs w:val="22"/>
                               </w:rPr>
                             </w:pPr>
-                            <w:bookmarkStart w:id="58" w:name="_Toc222209654"/>
+                            <w:bookmarkStart w:id="35" w:name="_Toc222209654"/>
                             <w:r>
                               <w:t xml:space="preserve">Abbildung </w:t>
                             </w:r>
@@ -10875,7 +10871,7 @@
                             <w:r>
                               <w:t xml:space="preserve"> - Zusammenbau</w:t>
                             </w:r>
-                            <w:bookmarkEnd w:id="58"/>
+                            <w:bookmarkEnd w:id="35"/>
                           </w:p>
                         </w:txbxContent>
                       </wps:txbx>
@@ -10961,7 +10957,7 @@
                     </pic:cNvPicPr>
                   </pic:nvPicPr>
                   <pic:blipFill rotWithShape="1">
-                    <a:blip r:embed="rId38" cstate="print">
+                    <a:blip r:embed="rId40" cstate="print">
                       <a:extLst>
                         <a:ext uri="{28A0092B-C50C-407E-A947-70E740481C1C}">
                           <a14:useLocalDpi xmlns:a14="http://schemas.microsoft.com/office/drawing/2010/main" val="0"/>
@@ -11294,7 +11290,7 @@
           <w:lang w:eastAsia="de-CH"/>
         </w:rPr>
       </w:pPr>
-      <w:bookmarkStart w:id="60" w:name="_Toc222209619"/>
+      <w:bookmarkStart w:id="36" w:name="_Toc222209619"/>
       <w:r>
         <w:rPr>
           <w:lang w:eastAsia="de-CH"/>
@@ -11302,7 +11298,7 @@
         <w:lastRenderedPageBreak/>
         <w:t>Programmierung</w:t>
       </w:r>
-      <w:bookmarkEnd w:id="60"/>
+      <w:bookmarkEnd w:id="36"/>
     </w:p>
     <w:p>
       <w:pPr>
@@ -11430,7 +11426,7 @@
                                 <w:szCs w:val="22"/>
                               </w:rPr>
                             </w:pPr>
-                            <w:bookmarkStart w:id="61" w:name="_Toc222209655"/>
+                            <w:bookmarkStart w:id="37" w:name="_Toc222209655"/>
                             <w:r>
                               <w:t xml:space="preserve">Abbildung </w:t>
                             </w:r>
@@ -11445,7 +11441,7 @@
                             <w:r>
                               <w:t xml:space="preserve"> - lcdSetup()</w:t>
                             </w:r>
-                            <w:bookmarkEnd w:id="61"/>
+                            <w:bookmarkEnd w:id="37"/>
                           </w:p>
                         </w:txbxContent>
                       </wps:txbx>
@@ -11529,7 +11525,7 @@
                     <pic:cNvPicPr/>
                   </pic:nvPicPr>
                   <pic:blipFill>
-                    <a:blip r:embed="rId39">
+                    <a:blip r:embed="rId41">
                       <a:extLst>
                         <a:ext uri="{28A0092B-C50C-407E-A947-70E740481C1C}">
                           <a14:useLocalDpi xmlns:a14="http://schemas.microsoft.com/office/drawing/2010/main" val="0"/>
@@ -11731,7 +11727,7 @@
                                 <w:szCs w:val="22"/>
                               </w:rPr>
                             </w:pPr>
-                            <w:bookmarkStart w:id="63" w:name="_Toc222209656"/>
+                            <w:bookmarkStart w:id="38" w:name="_Toc222209656"/>
                             <w:r>
                               <w:t xml:space="preserve">Abbildung </w:t>
                             </w:r>
@@ -11746,7 +11742,7 @@
                             <w:r>
                               <w:t xml:space="preserve"> - printTimeAndDate()</w:t>
                             </w:r>
-                            <w:bookmarkEnd w:id="63"/>
+                            <w:bookmarkEnd w:id="38"/>
                           </w:p>
                         </w:txbxContent>
                       </wps:txbx>
@@ -11830,7 +11826,7 @@
                     <pic:cNvPicPr/>
                   </pic:nvPicPr>
                   <pic:blipFill>
-                    <a:blip r:embed="rId40">
+                    <a:blip r:embed="rId42">
                       <a:extLst>
                         <a:ext uri="{28A0092B-C50C-407E-A947-70E740481C1C}">
                           <a14:useLocalDpi xmlns:a14="http://schemas.microsoft.com/office/drawing/2010/main" val="0"/>
@@ -12098,7 +12094,7 @@
                                 <w:szCs w:val="22"/>
                               </w:rPr>
                             </w:pPr>
-                            <w:bookmarkStart w:id="65" w:name="_Toc222209657"/>
+                            <w:bookmarkStart w:id="39" w:name="_Toc222209657"/>
                             <w:r>
                               <w:t xml:space="preserve">Abbildung </w:t>
                             </w:r>
@@ -12113,7 +12109,7 @@
                             <w:r>
                               <w:t xml:space="preserve"> - printTempandCO2</w:t>
                             </w:r>
-                            <w:bookmarkEnd w:id="65"/>
+                            <w:bookmarkEnd w:id="39"/>
                           </w:p>
                         </w:txbxContent>
                       </wps:txbx>
@@ -12200,7 +12196,7 @@
                     <pic:cNvPicPr/>
                   </pic:nvPicPr>
                   <pic:blipFill>
-                    <a:blip r:embed="rId41">
+                    <a:blip r:embed="rId43">
                       <a:extLst>
                         <a:ext uri="{28A0092B-C50C-407E-A947-70E740481C1C}">
                           <a14:useLocalDpi xmlns:a14="http://schemas.microsoft.com/office/drawing/2010/main" val="0"/>
@@ -12440,7 +12436,7 @@
                                 <w:szCs w:val="22"/>
                               </w:rPr>
                             </w:pPr>
-                            <w:bookmarkStart w:id="67" w:name="_Toc222209658"/>
+                            <w:bookmarkStart w:id="40" w:name="_Toc222209658"/>
                             <w:r>
                               <w:t xml:space="preserve">Abbildung </w:t>
                             </w:r>
@@ -12455,7 +12451,7 @@
                             <w:r>
                               <w:t xml:space="preserve"> - warnBuzz()</w:t>
                             </w:r>
-                            <w:bookmarkEnd w:id="67"/>
+                            <w:bookmarkEnd w:id="40"/>
                           </w:p>
                         </w:txbxContent>
                       </wps:txbx>
@@ -12538,7 +12534,7 @@
                     <pic:cNvPicPr/>
                   </pic:nvPicPr>
                   <pic:blipFill>
-                    <a:blip r:embed="rId42">
+                    <a:blip r:embed="rId44">
                       <a:extLst>
                         <a:ext uri="{28A0092B-C50C-407E-A947-70E740481C1C}">
                           <a14:useLocalDpi xmlns:a14="http://schemas.microsoft.com/office/drawing/2010/main" val="0"/>
@@ -12848,7 +12844,7 @@
                                 <w:szCs w:val="22"/>
                               </w:rPr>
                             </w:pPr>
-                            <w:bookmarkStart w:id="69" w:name="_Toc222209659"/>
+                            <w:bookmarkStart w:id="41" w:name="_Toc222209659"/>
                             <w:r>
                               <w:t xml:space="preserve">Abbildung </w:t>
                             </w:r>
@@ -12863,7 +12859,7 @@
                             <w:r>
                               <w:t xml:space="preserve"> - timerBuzz()</w:t>
                             </w:r>
-                            <w:bookmarkEnd w:id="69"/>
+                            <w:bookmarkEnd w:id="41"/>
                           </w:p>
                         </w:txbxContent>
                       </wps:txbx>
@@ -12946,7 +12942,7 @@
                     <pic:cNvPicPr/>
                   </pic:nvPicPr>
                   <pic:blipFill>
-                    <a:blip r:embed="rId43">
+                    <a:blip r:embed="rId45">
                       <a:extLst>
                         <a:ext uri="{28A0092B-C50C-407E-A947-70E740481C1C}">
                           <a14:useLocalDpi xmlns:a14="http://schemas.microsoft.com/office/drawing/2010/main" val="0"/>
@@ -13044,7 +13040,7 @@
                                 <w:szCs w:val="22"/>
                               </w:rPr>
                             </w:pPr>
-                            <w:bookmarkStart w:id="71" w:name="_Toc222209660"/>
+                            <w:bookmarkStart w:id="42" w:name="_Toc222209660"/>
                             <w:r>
                               <w:t xml:space="preserve">Abbildung </w:t>
                             </w:r>
@@ -13059,7 +13055,7 @@
                             <w:r>
                               <w:t xml:space="preserve"> - connectWifi()</w:t>
                             </w:r>
-                            <w:bookmarkEnd w:id="71"/>
+                            <w:bookmarkEnd w:id="42"/>
                           </w:p>
                         </w:txbxContent>
                       </wps:txbx>
@@ -13142,7 +13138,7 @@
                     <pic:cNvPicPr/>
                   </pic:nvPicPr>
                   <pic:blipFill>
-                    <a:blip r:embed="rId44">
+                    <a:blip r:embed="rId46">
                       <a:extLst>
                         <a:ext uri="{28A0092B-C50C-407E-A947-70E740481C1C}">
                           <a14:useLocalDpi xmlns:a14="http://schemas.microsoft.com/office/drawing/2010/main" val="0"/>
@@ -13316,7 +13312,7 @@
                                 <w:szCs w:val="22"/>
                               </w:rPr>
                             </w:pPr>
-                            <w:bookmarkStart w:id="73" w:name="_Toc222209661"/>
+                            <w:bookmarkStart w:id="43" w:name="_Toc222209661"/>
                             <w:r>
                               <w:t xml:space="preserve">Abbildung </w:t>
                             </w:r>
@@ -13331,7 +13327,7 @@
                             <w:r>
                               <w:t xml:space="preserve"> - buttonReleaseHandler()</w:t>
                             </w:r>
-                            <w:bookmarkEnd w:id="73"/>
+                            <w:bookmarkEnd w:id="43"/>
                           </w:p>
                         </w:txbxContent>
                       </wps:txbx>
@@ -13412,7 +13408,7 @@
                     <pic:cNvPicPr/>
                   </pic:nvPicPr>
                   <pic:blipFill>
-                    <a:blip r:embed="rId45">
+                    <a:blip r:embed="rId47">
                       <a:extLst>
                         <a:ext uri="{28A0092B-C50C-407E-A947-70E740481C1C}">
                           <a14:useLocalDpi xmlns:a14="http://schemas.microsoft.com/office/drawing/2010/main" val="0"/>
@@ -13593,7 +13589,7 @@
                     <pic:cNvPicPr/>
                   </pic:nvPicPr>
                   <pic:blipFill>
-                    <a:blip r:embed="rId46">
+                    <a:blip r:embed="rId48">
                       <a:extLst>
                         <a:ext uri="{28A0092B-C50C-407E-A947-70E740481C1C}">
                           <a14:useLocalDpi xmlns:a14="http://schemas.microsoft.com/office/drawing/2010/main" val="0"/>
@@ -13689,7 +13685,10 @@
                               <w:t xml:space="preserve"> Wenn beide Bedingungen erfüllt sind</w:t>
                             </w:r>
                             <w:r>
-                              <w:t>, wird der momentane Zustand (Anzeige) auf einen neuen (ausgewählten) Zustand gesetzt. Der ButtonRelease wird erneut gekehrt (Knopf ist bereit für den nächsten Klick) und der Klick anschliessend gelöscht mit popPressedQueue().</w:t>
+                              <w:t xml:space="preserve">, wird der momentane Zustand (Anzeige) auf einen neuen (ausgewählten) Zustand gesetzt. </w:t>
+                            </w:r>
+                            <w:r>
+                              <w:t>Der ButtonRelease wird erneut gekehrt (Knopf ist bereit für den nächsten Klick) und der Klick anschliessend gelöscht mit popPressedQueue().</w:t>
                             </w:r>
                           </w:p>
                         </w:txbxContent>
@@ -13826,7 +13825,7 @@
                                 <w:szCs w:val="22"/>
                               </w:rPr>
                             </w:pPr>
-                            <w:bookmarkStart w:id="75" w:name="_Toc222209662"/>
+                            <w:bookmarkStart w:id="44" w:name="_Toc222209662"/>
                             <w:r>
                               <w:t xml:space="preserve">Abbildung </w:t>
                             </w:r>
@@ -13841,7 +13840,7 @@
                             <w:r>
                               <w:t xml:space="preserve"> - HandleMenuChange()</w:t>
                             </w:r>
-                            <w:bookmarkEnd w:id="75"/>
+                            <w:bookmarkEnd w:id="44"/>
                           </w:p>
                         </w:txbxContent>
                       </wps:txbx>
@@ -13949,7 +13948,7 @@
                                 <w:szCs w:val="22"/>
                               </w:rPr>
                             </w:pPr>
-                            <w:bookmarkStart w:id="77" w:name="_Toc222209663"/>
+                            <w:bookmarkStart w:id="45" w:name="_Toc222209663"/>
                             <w:r>
                               <w:t xml:space="preserve">Abbildung </w:t>
                             </w:r>
@@ -13964,7 +13963,7 @@
                             <w:r>
                               <w:t xml:space="preserve"> - manageMenu()</w:t>
                             </w:r>
-                            <w:bookmarkEnd w:id="77"/>
+                            <w:bookmarkEnd w:id="45"/>
                           </w:p>
                         </w:txbxContent>
                       </wps:txbx>
@@ -14047,7 +14046,7 @@
                     <pic:cNvPicPr/>
                   </pic:nvPicPr>
                   <pic:blipFill>
-                    <a:blip r:embed="rId47">
+                    <a:blip r:embed="rId49">
                       <a:extLst>
                         <a:ext uri="{28A0092B-C50C-407E-A947-70E740481C1C}">
                           <a14:useLocalDpi xmlns:a14="http://schemas.microsoft.com/office/drawing/2010/main" val="0"/>
@@ -14349,7 +14348,7 @@
                                 <w:szCs w:val="22"/>
                               </w:rPr>
                             </w:pPr>
-                            <w:bookmarkStart w:id="79" w:name="_Toc222209664"/>
+                            <w:bookmarkStart w:id="46" w:name="_Toc222209664"/>
                             <w:r>
                               <w:t xml:space="preserve">Abbildung </w:t>
                             </w:r>
@@ -14364,7 +14363,7 @@
                             <w:r>
                               <w:t xml:space="preserve"> - clearDisplayOnce()</w:t>
                             </w:r>
-                            <w:bookmarkEnd w:id="79"/>
+                            <w:bookmarkEnd w:id="46"/>
                           </w:p>
                         </w:txbxContent>
                       </wps:txbx>
@@ -14447,7 +14446,7 @@
                     <pic:cNvPicPr/>
                   </pic:nvPicPr>
                   <pic:blipFill>
-                    <a:blip r:embed="rId48">
+                    <a:blip r:embed="rId50">
                       <a:extLst>
                         <a:ext uri="{28A0092B-C50C-407E-A947-70E740481C1C}">
                           <a14:useLocalDpi xmlns:a14="http://schemas.microsoft.com/office/drawing/2010/main" val="0"/>
@@ -14733,7 +14732,7 @@
                                 <w:szCs w:val="22"/>
                               </w:rPr>
                             </w:pPr>
-                            <w:bookmarkStart w:id="81" w:name="_Toc222209665"/>
+                            <w:bookmarkStart w:id="47" w:name="_Toc222209665"/>
                             <w:r>
                               <w:t xml:space="preserve">Abbildung </w:t>
                             </w:r>
@@ -14748,7 +14747,7 @@
                             <w:r>
                               <w:t xml:space="preserve"> - timerInit()</w:t>
                             </w:r>
-                            <w:bookmarkEnd w:id="81"/>
+                            <w:bookmarkEnd w:id="47"/>
                           </w:p>
                         </w:txbxContent>
                       </wps:txbx>
@@ -14831,7 +14830,7 @@
                     <pic:cNvPicPr/>
                   </pic:nvPicPr>
                   <pic:blipFill>
-                    <a:blip r:embed="rId49">
+                    <a:blip r:embed="rId51">
                       <a:extLst>
                         <a:ext uri="{28A0092B-C50C-407E-A947-70E740481C1C}">
                           <a14:useLocalDpi xmlns:a14="http://schemas.microsoft.com/office/drawing/2010/main" val="0"/>
@@ -15048,7 +15047,7 @@
                                 <w:szCs w:val="22"/>
                               </w:rPr>
                             </w:pPr>
-                            <w:bookmarkStart w:id="83" w:name="_Toc222209666"/>
+                            <w:bookmarkStart w:id="48" w:name="_Toc222209666"/>
                             <w:r>
                               <w:t xml:space="preserve">Abbildung </w:t>
                             </w:r>
@@ -15063,7 +15062,7 @@
                             <w:r>
                               <w:t xml:space="preserve"> - InitializeTimerVariables()</w:t>
                             </w:r>
-                            <w:bookmarkEnd w:id="83"/>
+                            <w:bookmarkEnd w:id="48"/>
                           </w:p>
                         </w:txbxContent>
                       </wps:txbx>
@@ -15146,7 +15145,7 @@
                     <pic:cNvPicPr/>
                   </pic:nvPicPr>
                   <pic:blipFill>
-                    <a:blip r:embed="rId50">
+                    <a:blip r:embed="rId52">
                       <a:extLst>
                         <a:ext uri="{28A0092B-C50C-407E-A947-70E740481C1C}">
                           <a14:useLocalDpi xmlns:a14="http://schemas.microsoft.com/office/drawing/2010/main" val="0"/>
@@ -15245,7 +15244,7 @@
                                 <w:szCs w:val="22"/>
                               </w:rPr>
                             </w:pPr>
-                            <w:bookmarkStart w:id="85" w:name="_Toc222209667"/>
+                            <w:bookmarkStart w:id="49" w:name="_Toc222209667"/>
                             <w:r>
                               <w:t xml:space="preserve">Abbildung </w:t>
                             </w:r>
@@ -15260,7 +15259,7 @@
                             <w:r>
                               <w:t xml:space="preserve"> - showTimer()</w:t>
                             </w:r>
-                            <w:bookmarkEnd w:id="85"/>
+                            <w:bookmarkEnd w:id="49"/>
                           </w:p>
                         </w:txbxContent>
                       </wps:txbx>
@@ -15343,7 +15342,7 @@
                     <pic:cNvPicPr/>
                   </pic:nvPicPr>
                   <pic:blipFill>
-                    <a:blip r:embed="rId51">
+                    <a:blip r:embed="rId53">
                       <a:extLst>
                         <a:ext uri="{28A0092B-C50C-407E-A947-70E740481C1C}">
                           <a14:useLocalDpi xmlns:a14="http://schemas.microsoft.com/office/drawing/2010/main" val="0"/>
@@ -15655,7 +15654,7 @@
                     <pic:cNvPicPr/>
                   </pic:nvPicPr>
                   <pic:blipFill>
-                    <a:blip r:embed="rId52">
+                    <a:blip r:embed="rId54">
                       <a:extLst>
                         <a:ext uri="{28A0092B-C50C-407E-A947-70E740481C1C}">
                           <a14:useLocalDpi xmlns:a14="http://schemas.microsoft.com/office/drawing/2010/main" val="0"/>
@@ -15906,7 +15905,7 @@
                                 <w:szCs w:val="22"/>
                               </w:rPr>
                             </w:pPr>
-                            <w:bookmarkStart w:id="87" w:name="_Toc222209668"/>
+                            <w:bookmarkStart w:id="50" w:name="_Toc222209668"/>
                             <w:r>
                               <w:t xml:space="preserve">Abbildung </w:t>
                             </w:r>
@@ -15921,7 +15920,7 @@
                             <w:r>
                               <w:t xml:space="preserve"> - chooseOption()</w:t>
                             </w:r>
-                            <w:bookmarkEnd w:id="87"/>
+                            <w:bookmarkEnd w:id="50"/>
                           </w:p>
                         </w:txbxContent>
                       </wps:txbx>
@@ -16004,7 +16003,7 @@
                     <pic:cNvPicPr/>
                   </pic:nvPicPr>
                   <pic:blipFill>
-                    <a:blip r:embed="rId53">
+                    <a:blip r:embed="rId55">
                       <a:extLst>
                         <a:ext uri="{28A0092B-C50C-407E-A947-70E740481C1C}">
                           <a14:useLocalDpi xmlns:a14="http://schemas.microsoft.com/office/drawing/2010/main" val="0"/>
@@ -16264,7 +16263,7 @@
                                 <w:szCs w:val="22"/>
                               </w:rPr>
                             </w:pPr>
-                            <w:bookmarkStart w:id="89" w:name="_Toc222209669"/>
+                            <w:bookmarkStart w:id="51" w:name="_Toc222209669"/>
                             <w:r>
                               <w:t xml:space="preserve">Abbildung </w:t>
                             </w:r>
@@ -16279,7 +16278,7 @@
                             <w:r>
                               <w:t xml:space="preserve"> - setTimer()</w:t>
                             </w:r>
-                            <w:bookmarkEnd w:id="89"/>
+                            <w:bookmarkEnd w:id="51"/>
                           </w:p>
                         </w:txbxContent>
                       </wps:txbx>
@@ -16362,7 +16361,7 @@
                     <pic:cNvPicPr/>
                   </pic:nvPicPr>
                   <pic:blipFill>
-                    <a:blip r:embed="rId54">
+                    <a:blip r:embed="rId56">
                       <a:extLst>
                         <a:ext uri="{28A0092B-C50C-407E-A947-70E740481C1C}">
                           <a14:useLocalDpi xmlns:a14="http://schemas.microsoft.com/office/drawing/2010/main" val="0"/>
@@ -16452,7 +16451,7 @@
                                 <w:szCs w:val="22"/>
                               </w:rPr>
                             </w:pPr>
-                            <w:bookmarkStart w:id="91" w:name="_Toc222209670"/>
+                            <w:bookmarkStart w:id="52" w:name="_Toc222209670"/>
                             <w:r>
                               <w:t xml:space="preserve">Abbildung </w:t>
                             </w:r>
@@ -16467,7 +16466,7 @@
                             <w:r>
                               <w:t xml:space="preserve"> - startTimer() Teil 1</w:t>
                             </w:r>
-                            <w:bookmarkEnd w:id="91"/>
+                            <w:bookmarkEnd w:id="52"/>
                           </w:p>
                         </w:txbxContent>
                       </wps:txbx>
@@ -16550,7 +16549,7 @@
                     <pic:cNvPicPr/>
                   </pic:nvPicPr>
                   <pic:blipFill>
-                    <a:blip r:embed="rId55">
+                    <a:blip r:embed="rId57">
                       <a:extLst>
                         <a:ext uri="{28A0092B-C50C-407E-A947-70E740481C1C}">
                           <a14:useLocalDpi xmlns:a14="http://schemas.microsoft.com/office/drawing/2010/main" val="0"/>
@@ -16727,7 +16726,7 @@
                                 <w:szCs w:val="22"/>
                               </w:rPr>
                             </w:pPr>
-                            <w:bookmarkStart w:id="93" w:name="_Toc222209671"/>
+                            <w:bookmarkStart w:id="53" w:name="_Toc222209671"/>
                             <w:r>
                               <w:t xml:space="preserve">Abbildung </w:t>
                             </w:r>
@@ -16742,7 +16741,7 @@
                             <w:r>
                               <w:t xml:space="preserve"> - startTimer() Teil 2</w:t>
                             </w:r>
-                            <w:bookmarkEnd w:id="93"/>
+                            <w:bookmarkEnd w:id="53"/>
                           </w:p>
                         </w:txbxContent>
                       </wps:txbx>
@@ -16825,7 +16824,7 @@
                     <pic:cNvPicPr/>
                   </pic:nvPicPr>
                   <pic:blipFill>
-                    <a:blip r:embed="rId56">
+                    <a:blip r:embed="rId58">
                       <a:extLst>
                         <a:ext uri="{28A0092B-C50C-407E-A947-70E740481C1C}">
                           <a14:useLocalDpi xmlns:a14="http://schemas.microsoft.com/office/drawing/2010/main" val="0"/>
@@ -17401,7 +17400,7 @@
                                 <w:lang w:val="de-DE"/>
                               </w:rPr>
                             </w:pPr>
-                            <w:bookmarkStart w:id="95" w:name="_Toc222209672"/>
+                            <w:bookmarkStart w:id="54" w:name="_Toc222209672"/>
                             <w:r>
                               <w:t xml:space="preserve">Abbildung </w:t>
                             </w:r>
@@ -17416,7 +17415,7 @@
                             <w:r>
                               <w:t xml:space="preserve"> - setup() Teil 1</w:t>
                             </w:r>
-                            <w:bookmarkEnd w:id="95"/>
+                            <w:bookmarkEnd w:id="54"/>
                           </w:p>
                         </w:txbxContent>
                       </wps:txbx>
@@ -17501,7 +17500,7 @@
                     <pic:cNvPicPr/>
                   </pic:nvPicPr>
                   <pic:blipFill rotWithShape="1">
-                    <a:blip r:embed="rId57">
+                    <a:blip r:embed="rId59">
                       <a:extLst>
                         <a:ext uri="{28A0092B-C50C-407E-A947-70E740481C1C}">
                           <a14:useLocalDpi xmlns:a14="http://schemas.microsoft.com/office/drawing/2010/main" val="0"/>
@@ -17784,7 +17783,7 @@
                                 <w:lang w:val="de-DE"/>
                               </w:rPr>
                             </w:pPr>
-                            <w:bookmarkStart w:id="97" w:name="_Toc222209673"/>
+                            <w:bookmarkStart w:id="55" w:name="_Toc222209673"/>
                             <w:r>
                               <w:t xml:space="preserve">Abbildung </w:t>
                             </w:r>
@@ -17799,7 +17798,7 @@
                             <w:r>
                               <w:t xml:space="preserve"> - setup() Teil 2</w:t>
                             </w:r>
-                            <w:bookmarkEnd w:id="97"/>
+                            <w:bookmarkEnd w:id="55"/>
                           </w:p>
                         </w:txbxContent>
                       </wps:txbx>
@@ -17884,7 +17883,7 @@
                     <pic:cNvPicPr/>
                   </pic:nvPicPr>
                   <pic:blipFill>
-                    <a:blip r:embed="rId58">
+                    <a:blip r:embed="rId60">
                       <a:extLst>
                         <a:ext uri="{28A0092B-C50C-407E-A947-70E740481C1C}">
                           <a14:useLocalDpi xmlns:a14="http://schemas.microsoft.com/office/drawing/2010/main" val="0"/>
@@ -18205,7 +18204,7 @@
                                 <w:lang w:val="de-DE"/>
                               </w:rPr>
                             </w:pPr>
-                            <w:bookmarkStart w:id="99" w:name="_Toc222209674"/>
+                            <w:bookmarkStart w:id="56" w:name="_Toc222209674"/>
                             <w:r>
                               <w:t xml:space="preserve">Abbildung </w:t>
                             </w:r>
@@ -18220,7 +18219,7 @@
                             <w:r>
                               <w:t xml:space="preserve"> - loop()</w:t>
                             </w:r>
-                            <w:bookmarkEnd w:id="99"/>
+                            <w:bookmarkEnd w:id="56"/>
                           </w:p>
                         </w:txbxContent>
                       </wps:txbx>
@@ -18305,7 +18304,7 @@
                     <pic:cNvPicPr/>
                   </pic:nvPicPr>
                   <pic:blipFill>
-                    <a:blip r:embed="rId59">
+                    <a:blip r:embed="rId61">
                       <a:extLst>
                         <a:ext uri="{28A0092B-C50C-407E-A947-70E740481C1C}">
                           <a14:useLocalDpi xmlns:a14="http://schemas.microsoft.com/office/drawing/2010/main" val="0"/>
@@ -18346,7 +18345,7 @@
           <w:lang w:val="de-DE"/>
         </w:rPr>
       </w:pPr>
-      <w:bookmarkStart w:id="101" w:name="_Toc222209620"/>
+      <w:bookmarkStart w:id="57" w:name="_Toc222209620"/>
       <w:r>
         <w:rPr>
           <w:lang w:val="de-DE"/>
@@ -18360,7 +18359,7 @@
         </w:rPr>
         <w:t>h</w:t>
       </w:r>
-      <w:bookmarkEnd w:id="101"/>
+      <w:bookmarkEnd w:id="57"/>
     </w:p>
     <w:p>
       <w:pPr>
@@ -18369,14 +18368,14 @@
           <w:lang w:val="de-DE"/>
         </w:rPr>
       </w:pPr>
-      <w:bookmarkStart w:id="102" w:name="_Toc222209621"/>
+      <w:bookmarkStart w:id="58" w:name="_Toc222209621"/>
       <w:r>
         <w:rPr>
           <w:lang w:val="de-DE"/>
         </w:rPr>
         <w:t>Installation</w:t>
       </w:r>
-      <w:bookmarkEnd w:id="102"/>
+      <w:bookmarkEnd w:id="58"/>
     </w:p>
     <w:p>
       <w:pPr>
@@ -18445,7 +18444,7 @@
         </w:rPr>
         <w:t xml:space="preserve">. Darin wird der </w:t>
       </w:r>
-      <w:hyperlink r:id="rId60" w:history="1">
+      <w:hyperlink r:id="rId62" w:history="1">
         <w:r>
           <w:rPr>
             <w:rStyle w:val="Hyperlink"/>
@@ -18517,14 +18516,14 @@
           <w:lang w:val="de-DE"/>
         </w:rPr>
       </w:pPr>
-      <w:bookmarkStart w:id="103" w:name="_Toc222209622"/>
+      <w:bookmarkStart w:id="59" w:name="_Toc222209622"/>
       <w:r>
         <w:rPr>
           <w:lang w:val="de-DE"/>
         </w:rPr>
         <w:t>Allgemeine Steuerungen</w:t>
       </w:r>
-      <w:bookmarkEnd w:id="103"/>
+      <w:bookmarkEnd w:id="59"/>
     </w:p>
     <w:p>
       <w:pPr>
@@ -18591,7 +18590,7 @@
           <w:lang w:val="de-DE"/>
         </w:rPr>
       </w:pPr>
-      <w:bookmarkStart w:id="104" w:name="_Toc222209623"/>
+      <w:bookmarkStart w:id="60" w:name="_Toc222209623"/>
       <w:r>
         <w:rPr>
           <w:lang w:val="de-DE"/>
@@ -18604,7 +18603,7 @@
         </w:rPr>
         <w:t>Steuerung</w:t>
       </w:r>
-      <w:bookmarkEnd w:id="104"/>
+      <w:bookmarkEnd w:id="60"/>
     </w:p>
     <w:p>
       <w:pPr>
@@ -18656,7 +18655,7 @@
           <w:lang w:val="de-DE"/>
         </w:rPr>
       </w:pPr>
-      <w:bookmarkStart w:id="105" w:name="_Toc222209624"/>
+      <w:bookmarkStart w:id="61" w:name="_Toc222209624"/>
       <w:r>
         <w:rPr>
           <w:lang w:val="de-DE"/>
@@ -18669,7 +18668,7 @@
         </w:rPr>
         <w:t>Steuerung</w:t>
       </w:r>
-      <w:bookmarkEnd w:id="105"/>
+      <w:bookmarkEnd w:id="61"/>
     </w:p>
     <w:p>
       <w:pPr>
@@ -18833,7 +18832,7 @@
                                 <w:szCs w:val="22"/>
                               </w:rPr>
                             </w:pPr>
-                            <w:bookmarkStart w:id="106" w:name="_Toc222209675"/>
+                            <w:bookmarkStart w:id="62" w:name="_Toc222209675"/>
                             <w:r>
                               <w:t xml:space="preserve">Abbildung </w:t>
                             </w:r>
@@ -18848,7 +18847,7 @@
                             <w:r>
                               <w:t xml:space="preserve"> - Timer Positionen</w:t>
                             </w:r>
-                            <w:bookmarkEnd w:id="106"/>
+                            <w:bookmarkEnd w:id="62"/>
                           </w:p>
                         </w:txbxContent>
                       </wps:txbx>
@@ -18908,7 +18907,7 @@
           <w:noProof/>
         </w:rPr>
         <w:drawing>
-          <wp:anchor distT="0" distB="0" distL="114300" distR="114300" simplePos="0" relativeHeight="252121088" behindDoc="0" locked="0" layoutInCell="1" allowOverlap="1" wp14:anchorId="2F0A9A98" wp14:editId="2BB35ABE">
+          <wp:anchor distT="0" distB="0" distL="114300" distR="114300" simplePos="0" relativeHeight="252121088" behindDoc="0" locked="0" layoutInCell="1" allowOverlap="1" wp14:anchorId="2F0A9A98" wp14:editId="594D32E7">
             <wp:simplePos x="0" y="0"/>
             <wp:positionH relativeFrom="margin">
               <wp:align>center</wp:align>
@@ -18933,7 +18932,7 @@
                     </pic:cNvPicPr>
                   </pic:nvPicPr>
                   <pic:blipFill>
-                    <a:blip r:embed="rId61" cstate="print">
+                    <a:blip r:embed="rId63" cstate="print">
                       <a:extLst>
                         <a:ext uri="{28A0092B-C50C-407E-A947-70E740481C1C}">
                           <a14:useLocalDpi xmlns:a14="http://schemas.microsoft.com/office/drawing/2010/main" val="0"/>
@@ -19161,7 +19160,7 @@
           <w:lang w:val="de-DE"/>
         </w:rPr>
       </w:pPr>
-      <w:bookmarkStart w:id="108" w:name="_Toc222209625"/>
+      <w:bookmarkStart w:id="63" w:name="_Toc222209625"/>
       <w:r>
         <w:rPr>
           <w:lang w:val="de-DE"/>
@@ -19169,7 +19168,7 @@
         <w:lastRenderedPageBreak/>
         <w:t>Wichtige Informationen</w:t>
       </w:r>
-      <w:bookmarkEnd w:id="108"/>
+      <w:bookmarkEnd w:id="63"/>
     </w:p>
     <w:p>
       <w:pPr>
@@ -19185,14 +19184,14 @@
           <w:lang w:val="de-DE"/>
         </w:rPr>
       </w:pPr>
-      <w:bookmarkStart w:id="109" w:name="_Toc222209626"/>
+      <w:bookmarkStart w:id="64" w:name="_Toc222209626"/>
       <w:r>
         <w:rPr>
           <w:lang w:val="de-DE"/>
         </w:rPr>
         <w:t>Sensoren</w:t>
       </w:r>
-      <w:bookmarkEnd w:id="109"/>
+      <w:bookmarkEnd w:id="64"/>
     </w:p>
     <w:p>
       <w:pPr>
@@ -19239,14 +19238,14 @@
           <w:lang w:val="de-DE"/>
         </w:rPr>
       </w:pPr>
-      <w:bookmarkStart w:id="110" w:name="_Toc222209627"/>
+      <w:bookmarkStart w:id="65" w:name="_Toc222209627"/>
       <w:r>
         <w:rPr>
           <w:lang w:val="de-DE"/>
         </w:rPr>
         <w:t>Joystick Verbindung</w:t>
       </w:r>
-      <w:bookmarkEnd w:id="110"/>
+      <w:bookmarkEnd w:id="65"/>
     </w:p>
     <w:p>
       <w:pPr>
@@ -19275,14 +19274,14 @@
           <w:lang w:val="de-DE"/>
         </w:rPr>
       </w:pPr>
-      <w:bookmarkStart w:id="111" w:name="_Toc222209628"/>
+      <w:bookmarkStart w:id="66" w:name="_Toc222209628"/>
       <w:r>
         <w:rPr>
           <w:lang w:val="de-DE"/>
         </w:rPr>
         <w:t>WLAN-Verbindung</w:t>
       </w:r>
-      <w:bookmarkEnd w:id="111"/>
+      <w:bookmarkEnd w:id="66"/>
     </w:p>
     <w:p>
       <w:pPr>
@@ -19341,7 +19340,7 @@
           <w:lang w:val="de-DE"/>
         </w:rPr>
       </w:pPr>
-      <w:bookmarkStart w:id="112" w:name="_Toc222209629"/>
+      <w:bookmarkStart w:id="67" w:name="_Toc222209629"/>
       <w:r>
         <w:rPr>
           <w:lang w:val="de-DE"/>
@@ -19349,7 +19348,7 @@
         <w:lastRenderedPageBreak/>
         <w:t>Verzeichnis</w:t>
       </w:r>
-      <w:bookmarkEnd w:id="112"/>
+      <w:bookmarkEnd w:id="67"/>
     </w:p>
     <w:p>
       <w:pPr>
@@ -19358,14 +19357,14 @@
           <w:lang w:val="de-DE"/>
         </w:rPr>
       </w:pPr>
-      <w:bookmarkStart w:id="113" w:name="_Toc222209630"/>
+      <w:bookmarkStart w:id="68" w:name="_Toc222209630"/>
       <w:r>
         <w:rPr>
           <w:lang w:val="de-DE"/>
         </w:rPr>
         <w:t>Abbildung</w:t>
       </w:r>
-      <w:bookmarkEnd w:id="113"/>
+      <w:bookmarkEnd w:id="68"/>
     </w:p>
     <w:p>
       <w:pPr>
@@ -22736,10 +22735,10 @@
       </w:pPr>
     </w:p>
     <w:sectPr>
-      <w:headerReference w:type="default" r:id="rId62"/>
-      <w:footerReference w:type="default" r:id="rId63"/>
-      <w:headerReference w:type="first" r:id="rId64"/>
-      <w:footerReference w:type="first" r:id="rId65"/>
+      <w:headerReference w:type="default" r:id="rId64"/>
+      <w:footerReference w:type="default" r:id="rId65"/>
+      <w:headerReference w:type="first" r:id="rId66"/>
+      <w:footerReference w:type="first" r:id="rId67"/>
       <w:pgSz w:w="11906" w:h="16838"/>
       <w:pgMar w:top="851" w:right="1274" w:bottom="993" w:left="1276" w:header="510" w:footer="567" w:gutter="0"/>
       <w:cols w:space="708"/>
@@ -22880,7 +22879,6 @@
         <w:dataBinding w:prefixMappings="xmlns:ns0='http://purl.org/dc/elements/1.1/' xmlns:ns1='http://schemas.openxmlformats.org/package/2006/metadata/core-properties' " w:xpath="/ns1:coreProperties[1]/ns1:category[1]" w:storeItemID="{6C3C8BC8-F283-45AE-878A-BAB7291924A1}"/>
         <w:text/>
       </w:sdtPr>
-      <w:sdtEndPr/>
       <w:sdtContent>
         <w:r>
           <w:rPr>
@@ -22923,7 +22921,6 @@
         <w:dataBinding w:prefixMappings="xmlns:ns0='http://purl.org/dc/elements/1.1/' xmlns:ns1='http://schemas.openxmlformats.org/package/2006/metadata/core-properties' " w:xpath="/ns1:coreProperties[1]/ns0:title[1]" w:storeItemID="{6C3C8BC8-F283-45AE-878A-BAB7291924A1}"/>
         <w:text/>
       </w:sdtPr>
-      <w:sdtEndPr/>
       <w:sdtContent>
         <w:r>
           <w:rPr>
@@ -22965,7 +22962,6 @@
         <w:dataBinding w:prefixMappings="xmlns:ns0='http://purl.org/dc/elements/1.1/' xmlns:ns1='http://schemas.openxmlformats.org/package/2006/metadata/core-properties' " w:xpath="/ns1:coreProperties[1]/ns1:contentStatus[1]" w:storeItemID="{6C3C8BC8-F283-45AE-878A-BAB7291924A1}"/>
         <w:text/>
       </w:sdtPr>
-      <w:sdtEndPr/>
       <w:sdtContent>
         <w:r>
           <w:rPr>
@@ -27870,6 +27866,7 @@
     <w:rsid w:val="00507F45"/>
     <w:rsid w:val="00517639"/>
     <w:rsid w:val="005177BC"/>
+    <w:rsid w:val="00591FBC"/>
     <w:rsid w:val="005B75BE"/>
     <w:rsid w:val="005D4A28"/>
     <w:rsid w:val="005E4D61"/>
@@ -27879,6 +27876,7 @@
     <w:rsid w:val="00631FB1"/>
     <w:rsid w:val="006F705E"/>
     <w:rsid w:val="0071323B"/>
+    <w:rsid w:val="007B4F9B"/>
     <w:rsid w:val="007E5DDF"/>
     <w:rsid w:val="0080206D"/>
     <w:rsid w:val="008413BF"/>
@@ -28603,15 +28601,6 @@
 </file>
 
 <file path=customXml/item1.xml><?xml version="1.0" encoding="utf-8"?>
-<?mso-contentType ?>
-<FormTemplates xmlns="http://schemas.microsoft.com/sharepoint/v3/contenttype/forms">
-  <Display>DocumentLibraryForm</Display>
-  <Edit>DocumentLibraryForm</Edit>
-  <New>DocumentLibraryForm</New>
-</FormTemplates>
-</file>
-
-<file path=customXml/item2.xml><?xml version="1.0" encoding="utf-8"?>
 <ct:contentTypeSchema xmlns:ct="http://schemas.microsoft.com/office/2006/metadata/contentType" xmlns:ma="http://schemas.microsoft.com/office/2006/metadata/properties/metaAttributes" ct:_="" ma:_="" ma:contentTypeName="Dokument" ma:contentTypeID="0x010100C4F2B0029DE02D469FA70E15BADFA56B" ma:contentTypeVersion="12" ma:contentTypeDescription="Ein neues Dokument erstellen." ma:contentTypeScope="" ma:versionID="1c4b8f94629e2e68a969352a0f0a758b">
   <xsd:schema xmlns:xsd="http://www.w3.org/2001/XMLSchema" xmlns:xs="http://www.w3.org/2001/XMLSchema" xmlns:p="http://schemas.microsoft.com/office/2006/metadata/properties" xmlns:ns3="d381607e-5916-43eb-9457-821d7cba7cea" targetNamespace="http://schemas.microsoft.com/office/2006/metadata/properties" ma:root="true" ma:fieldsID="a792a08123e3766b54e62742d0d27cb1" ns3:_="">
     <xsd:import namespace="d381607e-5916-43eb-9457-821d7cba7cea"/>
@@ -28805,7 +28794,7 @@
 </ct:contentTypeSchema>
 </file>
 
-<file path=customXml/item3.xml><?xml version="1.0" encoding="utf-8"?>
+<file path=customXml/item2.xml><?xml version="1.0" encoding="utf-8"?>
 <p:properties xmlns:p="http://schemas.microsoft.com/office/2006/metadata/properties" xmlns:xsi="http://www.w3.org/2001/XMLSchema-instance" xmlns:pc="http://schemas.microsoft.com/office/infopath/2007/PartnerControls">
   <documentManagement>
     <_activity xmlns="d381607e-5916-43eb-9457-821d7cba7cea" xsi:nil="true"/>
@@ -28813,19 +28802,20 @@
 </p:properties>
 </file>
 
+<file path=customXml/item3.xml><?xml version="1.0" encoding="utf-8"?>
+<?mso-contentType ?>
+<FormTemplates xmlns="http://schemas.microsoft.com/sharepoint/v3/contenttype/forms">
+  <Display>DocumentLibraryForm</Display>
+  <Edit>DocumentLibraryForm</Edit>
+  <New>DocumentLibraryForm</New>
+</FormTemplates>
+</file>
+
 <file path=customXml/item4.xml><?xml version="1.0" encoding="utf-8"?>
 <b:Sources xmlns:b="http://schemas.openxmlformats.org/officeDocument/2006/bibliography" xmlns="http://schemas.openxmlformats.org/officeDocument/2006/bibliography" SelectedStyle="\APASixthEditionOfficeOnline.xsl" StyleName="APA" Version="6"/>
 </file>
 
 <file path=customXml/itemProps1.xml><?xml version="1.0" encoding="utf-8"?>
-<ds:datastoreItem xmlns:ds="http://schemas.openxmlformats.org/officeDocument/2006/customXml" ds:itemID="{0494ADC6-6FDC-4384-9E53-3B9C03EA5998}">
-  <ds:schemaRefs>
-    <ds:schemaRef ds:uri="http://schemas.microsoft.com/sharepoint/v3/contenttype/forms"/>
-  </ds:schemaRefs>
-</ds:datastoreItem>
-</file>
-
-<file path=customXml/itemProps2.xml><?xml version="1.0" encoding="utf-8"?>
 <ds:datastoreItem xmlns:ds="http://schemas.openxmlformats.org/officeDocument/2006/customXml" ds:itemID="{85AA5D54-57FF-49A8-B1C0-80988D5CA53E}">
   <ds:schemaRefs>
     <ds:schemaRef ds:uri="http://schemas.microsoft.com/office/2006/metadata/contentType"/>
@@ -28843,12 +28833,20 @@
 </ds:datastoreItem>
 </file>
 
-<file path=customXml/itemProps3.xml><?xml version="1.0" encoding="utf-8"?>
+<file path=customXml/itemProps2.xml><?xml version="1.0" encoding="utf-8"?>
 <ds:datastoreItem xmlns:ds="http://schemas.openxmlformats.org/officeDocument/2006/customXml" ds:itemID="{CBA37030-E913-4E37-A03C-881271D4064D}">
   <ds:schemaRefs>
     <ds:schemaRef ds:uri="http://schemas.microsoft.com/office/2006/metadata/properties"/>
     <ds:schemaRef ds:uri="http://schemas.microsoft.com/office/infopath/2007/PartnerControls"/>
     <ds:schemaRef ds:uri="d381607e-5916-43eb-9457-821d7cba7cea"/>
+  </ds:schemaRefs>
+</ds:datastoreItem>
+</file>
+
+<file path=customXml/itemProps3.xml><?xml version="1.0" encoding="utf-8"?>
+<ds:datastoreItem xmlns:ds="http://schemas.openxmlformats.org/officeDocument/2006/customXml" ds:itemID="{0494ADC6-6FDC-4384-9E53-3B9C03EA5998}">
+  <ds:schemaRefs>
+    <ds:schemaRef ds:uri="http://schemas.microsoft.com/sharepoint/v3/contenttype/forms"/>
   </ds:schemaRefs>
 </ds:datastoreItem>
 </file>

</xml_diff>